<commit_message>
has been added the element editor on the edit current config tab and the config editor, with a structure tree to add, move and remove elements, dynamic fields by element type and a JSON tab, the Test suite document of the Amount to pay message on DLG_InicioCobroActual, and updated the support note with the new editor
Co-Authored-By: Claude Opus 5.5 <noreply@anthropic.com>
</commit_message>
<xml_diff>
--- a/docs/Support note.docx
+++ b/docs/Support note.docx
@@ -911,7 +911,7 @@
                 <w:rFonts w:ascii="Arial" w:hAnsi="Arial" w:cs="Arial"/>
                 <w:lang w:val="en-US" w:eastAsia="es-ES_tradnl"/>
               </w:rPr>
-              <w:t>23/09/2026</w:t>
+              <w:t>30/09/2026</w:t>
             </w:r>
           </w:p>
         </w:tc>
@@ -1398,6 +1398,13 @@
                 <w:sz w:val="22"/>
               </w:rPr>
             </w:pPr>
+            <w:r>
+              <w:rPr>
+                <w:rFonts w:ascii="Arial" w:hAnsi="Arial" w:cs="Arial"/>
+                <w:sz w:val="22"/>
+              </w:rPr>
+              <w:t>3</w:t>
+            </w:r>
           </w:p>
         </w:tc>
         <w:tc>
@@ -1413,6 +1420,13 @@
                 <w:sz w:val="22"/>
               </w:rPr>
             </w:pPr>
+            <w:r>
+              <w:rPr>
+                <w:rFonts w:ascii="Arial" w:hAnsi="Arial" w:cs="Arial"/>
+                <w:sz w:val="22"/>
+              </w:rPr>
+              <w:t>30/09/2026</w:t>
+            </w:r>
           </w:p>
         </w:tc>
         <w:tc>
@@ -1428,6 +1442,13 @@
                 <w:sz w:val="22"/>
               </w:rPr>
             </w:pPr>
+            <w:r>
+              <w:rPr>
+                <w:rFonts w:ascii="Arial" w:hAnsi="Arial" w:cs="Arial"/>
+                <w:sz w:val="22"/>
+              </w:rPr>
+              <w:t>DVERA</w:t>
+            </w:r>
           </w:p>
         </w:tc>
         <w:tc>
@@ -1443,6 +1464,13 @@
                 <w:sz w:val="22"/>
               </w:rPr>
             </w:pPr>
+            <w:r>
+              <w:rPr>
+                <w:rFonts w:ascii="Arial" w:hAnsi="Arial" w:cs="Arial"/>
+                <w:sz w:val="22"/>
+              </w:rPr>
+              <w:t>11-12</w:t>
+            </w:r>
           </w:p>
         </w:tc>
         <w:tc>
@@ -1460,6 +1488,13 @@
                 <w:sz w:val="22"/>
               </w:rPr>
             </w:pPr>
+            <w:r>
+              <w:rPr>
+                <w:rFonts w:ascii="Arial" w:hAnsi="Arial" w:cs="Arial"/>
+                <w:sz w:val="22"/>
+              </w:rPr>
+              <w:t>Edit current config tab: new element editor with a Properties tab (structure tree to add, move and remove elements, and fields by element type) and a JSON tab.</w:t>
+            </w:r>
           </w:p>
         </w:tc>
       </w:tr>
@@ -3821,7 +3856,7 @@
             </w:rPr>
             <w:fldChar w:fldCharType="separate"/>
           </w:r>
-          <w:hyperlink w:anchor="_Toc241016476" w:history="1">
+          <w:hyperlink w:anchor="_Toc241621370" w:history="1">
             <w:r>
               <w:rPr>
                 <w:rStyle w:val="Hyperlink"/>
@@ -3845,7 +3880,7 @@
               <w:rPr>
                 <w:webHidden/>
               </w:rPr>
-              <w:instrText xml:space="preserve"> PAGEREF _Toc241016476 \h </w:instrText>
+              <w:instrText xml:space="preserve"> PAGEREF _Toc241621370 \h </w:instrText>
             </w:r>
             <w:r>
               <w:rPr>
@@ -3884,7 +3919,7 @@
               <w14:ligatures w14:val="standardContextual"/>
             </w:rPr>
           </w:pPr>
-          <w:hyperlink w:anchor="_Toc241016477" w:history="1">
+          <w:hyperlink w:anchor="_Toc241621371" w:history="1">
             <w:r>
               <w:rPr>
                 <w:rStyle w:val="Hyperlink"/>
@@ -3908,7 +3943,7 @@
               <w:rPr>
                 <w:webHidden/>
               </w:rPr>
-              <w:instrText xml:space="preserve"> PAGEREF _Toc241016477 \h </w:instrText>
+              <w:instrText xml:space="preserve"> PAGEREF _Toc241621371 \h </w:instrText>
             </w:r>
             <w:r>
               <w:rPr>
@@ -3947,7 +3982,7 @@
               <w14:ligatures w14:val="standardContextual"/>
             </w:rPr>
           </w:pPr>
-          <w:hyperlink w:anchor="_Toc241016478" w:history="1">
+          <w:hyperlink w:anchor="_Toc241621372" w:history="1">
             <w:r>
               <w:rPr>
                 <w:rStyle w:val="Hyperlink"/>
@@ -3971,7 +4006,7 @@
               <w:rPr>
                 <w:webHidden/>
               </w:rPr>
-              <w:instrText xml:space="preserve"> PAGEREF _Toc241016478 \h </w:instrText>
+              <w:instrText xml:space="preserve"> PAGEREF _Toc241621372 \h </w:instrText>
             </w:r>
             <w:r>
               <w:rPr>
@@ -4010,7 +4045,7 @@
               <w14:ligatures w14:val="standardContextual"/>
             </w:rPr>
           </w:pPr>
-          <w:hyperlink w:anchor="_Toc241016479" w:history="1">
+          <w:hyperlink w:anchor="_Toc241621373" w:history="1">
             <w:r>
               <w:rPr>
                 <w:rStyle w:val="Hyperlink"/>
@@ -4034,7 +4069,7 @@
               <w:rPr>
                 <w:webHidden/>
               </w:rPr>
-              <w:instrText xml:space="preserve"> PAGEREF _Toc241016479 \h </w:instrText>
+              <w:instrText xml:space="preserve"> PAGEREF _Toc241621373 \h </w:instrText>
             </w:r>
             <w:r>
               <w:rPr>
@@ -4073,7 +4108,7 @@
               <w14:ligatures w14:val="standardContextual"/>
             </w:rPr>
           </w:pPr>
-          <w:hyperlink w:anchor="_Toc241016480" w:history="1">
+          <w:hyperlink w:anchor="_Toc241621374" w:history="1">
             <w:r>
               <w:rPr>
                 <w:rStyle w:val="Hyperlink"/>
@@ -4115,7 +4150,7 @@
               <w:rPr>
                 <w:webHidden/>
               </w:rPr>
-              <w:instrText xml:space="preserve"> PAGEREF _Toc241016480 \h </w:instrText>
+              <w:instrText xml:space="preserve"> PAGEREF _Toc241621374 \h </w:instrText>
             </w:r>
             <w:r>
               <w:rPr>
@@ -4155,7 +4190,7 @@
               <w14:ligatures w14:val="standardContextual"/>
             </w:rPr>
           </w:pPr>
-          <w:hyperlink w:anchor="_Toc241016481" w:history="1">
+          <w:hyperlink w:anchor="_Toc241621375" w:history="1">
             <w:r>
               <w:rPr>
                 <w:rStyle w:val="Hyperlink"/>
@@ -4183,7 +4218,7 @@
                 <w:noProof/>
                 <w:webHidden/>
               </w:rPr>
-              <w:instrText xml:space="preserve"> PAGEREF _Toc241016481 \h </w:instrText>
+              <w:instrText xml:space="preserve"> PAGEREF _Toc241621375 \h </w:instrText>
             </w:r>
             <w:r>
               <w:rPr>
@@ -4226,7 +4261,7 @@
               <w14:ligatures w14:val="standardContextual"/>
             </w:rPr>
           </w:pPr>
-          <w:hyperlink w:anchor="_Toc241016482" w:history="1">
+          <w:hyperlink w:anchor="_Toc241621376" w:history="1">
             <w:r>
               <w:rPr>
                 <w:rStyle w:val="Hyperlink"/>
@@ -4268,7 +4303,7 @@
               <w:rPr>
                 <w:webHidden/>
               </w:rPr>
-              <w:instrText xml:space="preserve"> PAGEREF _Toc241016482 \h </w:instrText>
+              <w:instrText xml:space="preserve"> PAGEREF _Toc241621376 \h </w:instrText>
             </w:r>
             <w:r>
               <w:rPr>
@@ -4308,7 +4343,7 @@
               <w14:ligatures w14:val="standardContextual"/>
             </w:rPr>
           </w:pPr>
-          <w:hyperlink w:anchor="_Toc241016483" w:history="1">
+          <w:hyperlink w:anchor="_Toc241621377" w:history="1">
             <w:r>
               <w:rPr>
                 <w:rStyle w:val="Hyperlink"/>
@@ -4336,7 +4371,7 @@
                 <w:noProof/>
                 <w:webHidden/>
               </w:rPr>
-              <w:instrText xml:space="preserve"> PAGEREF _Toc241016483 \h </w:instrText>
+              <w:instrText xml:space="preserve"> PAGEREF _Toc241621377 \h </w:instrText>
             </w:r>
             <w:r>
               <w:rPr>
@@ -4380,7 +4415,7 @@
               <w14:ligatures w14:val="standardContextual"/>
             </w:rPr>
           </w:pPr>
-          <w:hyperlink w:anchor="_Toc241016484" w:history="1">
+          <w:hyperlink w:anchor="_Toc241621378" w:history="1">
             <w:r>
               <w:rPr>
                 <w:rStyle w:val="Hyperlink"/>
@@ -4407,7 +4442,7 @@
                 <w:noProof/>
                 <w:webHidden/>
               </w:rPr>
-              <w:instrText xml:space="preserve"> PAGEREF _Toc241016484 \h </w:instrText>
+              <w:instrText xml:space="preserve"> PAGEREF _Toc241621378 \h </w:instrText>
             </w:r>
             <w:r>
               <w:rPr>
@@ -4451,7 +4486,7 @@
               <w14:ligatures w14:val="standardContextual"/>
             </w:rPr>
           </w:pPr>
-          <w:hyperlink w:anchor="_Toc241016485" w:history="1">
+          <w:hyperlink w:anchor="_Toc241621379" w:history="1">
             <w:r>
               <w:rPr>
                 <w:rStyle w:val="Hyperlink"/>
@@ -4478,7 +4513,7 @@
                 <w:noProof/>
                 <w:webHidden/>
               </w:rPr>
-              <w:instrText xml:space="preserve"> PAGEREF _Toc241016485 \h </w:instrText>
+              <w:instrText xml:space="preserve"> PAGEREF _Toc241621379 \h </w:instrText>
             </w:r>
             <w:r>
               <w:rPr>
@@ -4556,7 +4591,7 @@
           <w:rFonts w:ascii="Arial" w:hAnsi="Arial" w:cs="Arial"/>
         </w:rPr>
       </w:pPr>
-      <w:bookmarkStart w:id="4" w:name="_Toc241016476"/>
+      <w:bookmarkStart w:id="4" w:name="_Toc241621370"/>
       <w:r>
         <w:rPr>
           <w:rFonts w:ascii="Arial" w:hAnsi="Arial" w:cs="Arial"/>
@@ -4593,7 +4628,7 @@
           <w:rFonts w:ascii="Arial" w:hAnsi="Arial" w:cs="Arial"/>
         </w:rPr>
       </w:pPr>
-      <w:bookmarkStart w:id="5" w:name="_Toc241016477"/>
+      <w:bookmarkStart w:id="5" w:name="_Toc241621371"/>
       <w:r>
         <w:rPr>
           <w:rFonts w:ascii="Arial" w:hAnsi="Arial" w:cs="Arial"/>
@@ -4716,7 +4751,7 @@
           <w:rFonts w:ascii="Arial" w:hAnsi="Arial" w:cs="Arial"/>
         </w:rPr>
       </w:pPr>
-      <w:bookmarkStart w:id="6" w:name="_Toc241016478"/>
+      <w:bookmarkStart w:id="6" w:name="_Toc241621372"/>
       <w:r>
         <w:rPr>
           <w:rFonts w:ascii="Arial" w:hAnsi="Arial" w:cs="Arial"/>
@@ -4789,7 +4824,7 @@
           <w:rFonts w:ascii="Arial" w:hAnsi="Arial" w:cs="Arial"/>
         </w:rPr>
       </w:pPr>
-      <w:bookmarkStart w:id="7" w:name="_Toc241016479"/>
+      <w:bookmarkStart w:id="7" w:name="_Toc241621373"/>
       <w:r>
         <w:rPr>
           <w:rFonts w:ascii="Arial" w:hAnsi="Arial" w:cs="Arial"/>
@@ -4874,7 +4909,7 @@
           <w:rFonts w:ascii="Arial" w:hAnsi="Arial" w:cs="Arial"/>
         </w:rPr>
       </w:pPr>
-      <w:bookmarkStart w:id="8" w:name="_Toc241016480"/>
+      <w:bookmarkStart w:id="8" w:name="_Toc241621374"/>
       <w:r>
         <w:rPr>
           <w:rFonts w:ascii="Arial" w:hAnsi="Arial" w:cs="Arial"/>
@@ -4890,7 +4925,7 @@
           <w:rFonts w:ascii="Arial" w:hAnsi="Arial" w:cs="Arial"/>
         </w:rPr>
       </w:pPr>
-      <w:bookmarkStart w:id="9" w:name="_Toc241016481"/>
+      <w:bookmarkStart w:id="9" w:name="_Toc241621375"/>
       <w:r>
         <w:rPr>
           <w:rFonts w:ascii="Arial" w:hAnsi="Arial" w:cs="Arial"/>
@@ -5555,6 +5590,7 @@
                 <w:rFonts w:ascii="Arial" w:hAnsi="Arial" w:cs="Arial"/>
                 <w:noProof/>
               </w:rPr>
+              <w:lastRenderedPageBreak/>
               <w:drawing>
                 <wp:inline distT="0" distB="0" distL="0" distR="0" wp14:anchorId="7F26BD94" wp14:editId="0C43D180">
                   <wp:extent cx="5731510" cy="1916430"/>
@@ -5937,7 +5973,7 @@
           <w:rFonts w:ascii="Arial" w:hAnsi="Arial" w:cs="Arial"/>
         </w:rPr>
       </w:pPr>
-      <w:bookmarkStart w:id="10" w:name="_Toc241016482"/>
+      <w:bookmarkStart w:id="10" w:name="_Toc241621376"/>
       <w:r>
         <w:rPr>
           <w:rFonts w:ascii="Arial" w:hAnsi="Arial" w:cs="Arial"/>
@@ -5956,8 +5992,15 @@
         <w:rPr>
           <w:rFonts w:ascii="Arial" w:hAnsi="Arial" w:cs="Arial"/>
         </w:rPr>
-        <w:t>The web configurator is the central tool for the maintenance and remote customisation of the application installed on the lane monitors. It allows modifying the connection parameters, managing configurations and resources, editing and testing screens and sharing settings between different devices, all through an interface accessible from any computer connected to the same local network.</w:t>
+        <w:t xml:space="preserve">The web configurator is the central tool for the maintenance and remote customisation of the application installed on the lane monitors. It allows modifying the connection parameters, managing configurations and resources, editing and testing screens and sharing settings </w:t>
       </w:r>
+      <w:r>
+        <w:rPr>
+          <w:rFonts w:ascii="Arial" w:hAnsi="Arial" w:cs="Arial"/>
+        </w:rPr>
+        <w:lastRenderedPageBreak/>
+        <w:t>between different devices, all through an interface accessible from any computer connected to the same local network.</w:t>
+      </w:r>
     </w:p>
     <w:p>
       <w:pPr>
@@ -5973,7 +6016,7 @@
           <w:rFonts w:ascii="Arial" w:hAnsi="Arial" w:cs="Arial"/>
         </w:rPr>
       </w:pPr>
-      <w:bookmarkStart w:id="11" w:name="_Toc241016483"/>
+      <w:bookmarkStart w:id="11" w:name="_Toc241621377"/>
       <w:r>
         <w:rPr>
           <w:rFonts w:ascii="Arial" w:hAnsi="Arial" w:cs="Arial"/>
@@ -6693,8 +6736,9 @@
       <w:pPr>
         <w:pStyle w:val="Heading3"/>
       </w:pPr>
-      <w:bookmarkStart w:id="12" w:name="_Toc241016484"/>
+      <w:bookmarkStart w:id="12" w:name="_Toc241621378"/>
       <w:r>
+        <w:lastRenderedPageBreak/>
         <w:t>Description of the main sections (tabs)</w:t>
       </w:r>
       <w:bookmarkEnd w:id="12"/>
@@ -7046,6 +7090,7 @@
                 <w:rFonts w:ascii="Arial" w:hAnsi="Arial" w:cs="Arial"/>
                 <w:noProof/>
               </w:rPr>
+              <w:lastRenderedPageBreak/>
               <w:drawing>
                 <wp:inline distT="0" distB="0" distL="0" distR="0" wp14:anchorId="79096618" wp14:editId="789E9456">
                   <wp:extent cx="5731510" cy="3884690"/>
@@ -7293,6 +7338,7 @@
         </w:numPr>
       </w:pPr>
       <w:r>
+        <w:lastRenderedPageBreak/>
         <w:t>Export</w:t>
       </w:r>
     </w:p>
@@ -7705,13 +7751,14 @@
           <w:b/>
           <w:bCs/>
         </w:rPr>
+        <w:lastRenderedPageBreak/>
         <w:t>Screen preview (centre):</w:t>
       </w:r>
       <w:r>
         <w:rPr>
           <w:rFonts w:ascii="Arial" w:hAnsi="Arial" w:cs="Arial"/>
         </w:rPr>
-        <w:t xml:space="preserve"> shows the selected screen. Click an element to load its code.</w:t>
+        <w:t xml:space="preserve"> shows the selected screen. Click an element to select it: it is highlighted with a blue border and loaded in the element editor.</w:t>
       </w:r>
     </w:p>
     <w:p>
@@ -7731,13 +7778,105 @@
           <w:b/>
           <w:bCs/>
         </w:rPr>
-        <w:t>Element code (right):</w:t>
+        <w:t>Element editor (right), Properties tab:</w:t>
       </w:r>
       <w:r>
         <w:rPr>
           <w:rFonts w:ascii="Arial" w:hAnsi="Arial" w:cs="Arial"/>
         </w:rPr>
-        <w:t xml:space="preserve"> allows editing the properties of the selected element directly in JSON (texts, colours, sizes, etc.).</w:t>
+        <w:t xml:space="preserve"> edits the selected element with fields instead of code:</w:t>
+      </w:r>
+    </w:p>
+    <w:p>
+      <w:pPr>
+        <w:pStyle w:val="ListParagraph"/>
+        <w:numPr>
+          <w:ilvl w:val="1"/>
+          <w:numId w:val="32"/>
+        </w:numPr>
+        <w:rPr>
+          <w:rFonts w:ascii="Arial" w:hAnsi="Arial" w:cs="Arial"/>
+        </w:rPr>
+      </w:pPr>
+      <w:r>
+        <w:rPr>
+          <w:rFonts w:ascii="Arial" w:hAnsi="Arial" w:cs="Arial"/>
+          <w:b/>
+          <w:bCs/>
+        </w:rPr>
+        <w:t>Structure:</w:t>
+      </w:r>
+      <w:r>
+        <w:rPr>
+          <w:rFonts w:ascii="Arial" w:hAnsi="Arial" w:cs="Arial"/>
+        </w:rPr>
+        <w:t xml:space="preserve"> tree with the selected element and all the elements it contains. Click a node to edit its fields. The </w:t>
+      </w:r>
+      <w:r>
+        <w:rPr>
+          <w:rFonts w:ascii="Arial" w:hAnsi="Arial" w:cs="Arial"/>
+          <w:b/>
+          <w:bCs/>
+        </w:rPr>
+        <w:t>+</w:t>
+      </w:r>
+      <w:r>
+        <w:rPr>
+          <w:rFonts w:ascii="Arial" w:hAnsi="Arial" w:cs="Arial"/>
+        </w:rPr>
+        <w:t xml:space="preserve"> icon of a box, column or row adds a new element at the end of it (box, column, row, text, image, spacer or video), the arrows move the element up or down inside its parent, and the bin icon removes the element with all its content.</w:t>
+      </w:r>
+    </w:p>
+    <w:p>
+      <w:pPr>
+        <w:pStyle w:val="ListParagraph"/>
+        <w:numPr>
+          <w:ilvl w:val="1"/>
+          <w:numId w:val="32"/>
+        </w:numPr>
+        <w:rPr>
+          <w:rFonts w:ascii="Arial" w:hAnsi="Arial" w:cs="Arial"/>
+        </w:rPr>
+      </w:pPr>
+      <w:r>
+        <w:rPr>
+          <w:rFonts w:ascii="Arial" w:hAnsi="Arial" w:cs="Arial"/>
+          <w:b/>
+          <w:bCs/>
+        </w:rPr>
+        <w:t>Fields:</w:t>
+      </w:r>
+      <w:r>
+        <w:rPr>
+          <w:rFonts w:ascii="Arial" w:hAnsi="Arial" w:cs="Arial"/>
+        </w:rPr>
+        <w:t xml:space="preserve"> depend on the element type: style (background colour with a colour sample, density, border radius, padding, spacing, width, height, margin, shadow), content (item ID, default text, file name, folder path), translations (a value for each language, which can be added or removed) and DIT binding (data key, DIT type code and valid value). The wrong values are marked in red.</w:t>
+      </w:r>
+    </w:p>
+    <w:p>
+      <w:pPr>
+        <w:pStyle w:val="ListParagraph"/>
+        <w:numPr>
+          <w:ilvl w:val="1"/>
+          <w:numId w:val="32"/>
+        </w:numPr>
+        <w:rPr>
+          <w:rFonts w:ascii="Arial" w:hAnsi="Arial" w:cs="Arial"/>
+        </w:rPr>
+      </w:pPr>
+      <w:r>
+        <w:rPr>
+          <w:rFonts w:ascii="Arial" w:hAnsi="Arial" w:cs="Arial"/>
+          <w:b/>
+          <w:bCs/>
+        </w:rPr>
+        <w:t>APPLY CHANGES:</w:t>
+      </w:r>
+      <w:r>
+        <w:rPr>
+          <w:rFonts w:ascii="Arial" w:hAnsi="Arial" w:cs="Arial"/>
+        </w:rPr>
+        <w:t xml:space="preserve"> applies the fields to the element and updates the screen preview. New elements are created with visible default values (for example, a text "New text" in white, size 30) so they can be seen on the preview straight away.</w:t>
       </w:r>
     </w:p>
     <w:p>
@@ -7754,30 +7893,56 @@
       <w:r>
         <w:rPr>
           <w:rFonts w:ascii="Arial" w:hAnsi="Arial" w:cs="Arial"/>
-        </w:rPr>
-        <w:t>Button “</w:t>
+          <w:b/>
+          <w:bCs/>
+        </w:rPr>
+        <w:t>Element editor (right), JSON tab:</w:t>
       </w:r>
       <w:r>
         <w:rPr>
           <w:rFonts w:ascii="Arial" w:hAnsi="Arial" w:cs="Arial"/>
-          <w:b/>
-          <w:color w:val="0F9ED5" w:themeColor="accent4"/>
-          <w14:textOutline w14:w="0" w14:cap="flat" w14:cmpd="sng" w14:algn="ctr">
-            <w14:noFill/>
-            <w14:prstDash w14:val="solid"/>
-            <w14:round/>
-          </w14:textOutline>
-          <w14:props3d w14:extrusionH="57150" w14:contourW="0" w14:prstMaterial="softEdge">
-            <w14:bevelT w14:w="25400" w14:h="38100" w14:prst="circle"/>
-          </w14:props3d>
-        </w:rPr>
-        <w:t>UPDATE</w:t>
+        </w:rPr>
+        <w:t xml:space="preserve"> shows the code of the element to edit it directly or to paste a complete element. </w:t>
       </w:r>
       <w:r>
         <w:rPr>
           <w:rFonts w:ascii="Arial" w:hAnsi="Arial" w:cs="Arial"/>
-        </w:rPr>
-        <w:t>”: applies the changes to the selected element and, after accepting the confirmation message, saves the configuration on the monitor.</w:t>
+          <w:b/>
+          <w:bCs/>
+        </w:rPr>
+        <w:t>APPLY CHANGES</w:t>
+      </w:r>
+      <w:r>
+        <w:rPr>
+          <w:rFonts w:ascii="Arial" w:hAnsi="Arial" w:cs="Arial"/>
+        </w:rPr>
+        <w:t xml:space="preserve"> updates the screen preview; if the code is not a valid element, an error message is shown in red and the button is disabled.</w:t>
+      </w:r>
+    </w:p>
+    <w:p>
+      <w:pPr>
+        <w:pStyle w:val="ListParagraph"/>
+        <w:numPr>
+          <w:ilvl w:val="0"/>
+          <w:numId w:val="32"/>
+        </w:numPr>
+        <w:rPr>
+          <w:rFonts w:ascii="Arial" w:hAnsi="Arial" w:cs="Arial"/>
+        </w:rPr>
+      </w:pPr>
+      <w:r>
+        <w:rPr>
+          <w:rFonts w:ascii="Arial" w:hAnsi="Arial" w:cs="Arial"/>
+          <w:b/>
+          <w:bCs/>
+        </w:rPr>
+        <w:t>Button "UPDATE":</w:t>
+      </w:r>
+      <w:r>
+        <w:rPr>
+          <w:rFonts w:ascii="Arial" w:hAnsi="Arial" w:cs="Arial"/>
+        </w:rPr>
+        <w:t xml:space="preserve"> saves the edited element on the monitor, after accepting the confirmation message.</w:t>
       </w:r>
     </w:p>
     <w:p>
@@ -7799,6 +7964,48 @@
           <w:rFonts w:ascii="Arial" w:hAnsi="Arial" w:cs="Arial"/>
         </w:rPr>
         <w:t xml:space="preserve"> If the confirmation message is cancelled, the changes are not saved on the monitor.</w:t>
+      </w:r>
+    </w:p>
+    <w:p>
+      <w:pPr>
+        <w:rPr>
+          <w:rFonts w:ascii="Arial" w:hAnsi="Arial" w:cs="Arial"/>
+        </w:rPr>
+      </w:pPr>
+      <w:r>
+        <w:rPr>
+          <w:rFonts w:ascii="Arial" w:hAnsi="Arial" w:cs="Arial"/>
+          <w:b/>
+          <w:bCs/>
+        </w:rPr>
+        <w:t>Note:</w:t>
+      </w:r>
+      <w:r>
+        <w:rPr>
+          <w:rFonts w:ascii="Arial" w:hAnsi="Arial" w:cs="Arial"/>
+        </w:rPr>
+        <w:t xml:space="preserve"> Selecting another screen in the Screen list discards the changes that were not saved with "UPDATE".</w:t>
+      </w:r>
+    </w:p>
+    <w:p>
+      <w:pPr>
+        <w:rPr>
+          <w:rFonts w:ascii="Arial" w:hAnsi="Arial" w:cs="Arial"/>
+        </w:rPr>
+      </w:pPr>
+      <w:r>
+        <w:rPr>
+          <w:rFonts w:ascii="Arial" w:hAnsi="Arial" w:cs="Arial"/>
+          <w:b/>
+          <w:bCs/>
+        </w:rPr>
+        <w:t>Note:</w:t>
+      </w:r>
+      <w:r>
+        <w:rPr>
+          <w:rFonts w:ascii="Arial" w:hAnsi="Arial" w:cs="Arial"/>
+        </w:rPr>
+        <w:t xml:space="preserve"> The document "Test suite" describes, step by step, how to enable or disable the "Amount to pay" message of the DLG_InicioCobroActual screen with this editor.</w:t>
       </w:r>
     </w:p>
     <w:p>
@@ -8690,7 +8897,7 @@
       <w:pPr>
         <w:pStyle w:val="Heading3"/>
       </w:pPr>
-      <w:bookmarkStart w:id="13" w:name="_Toc241016485"/>
+      <w:bookmarkStart w:id="13" w:name="_Toc241621379"/>
       <w:r>
         <w:t>Editing the configuration</w:t>
       </w:r>
@@ -8725,7 +8932,7 @@
         <w:rPr>
           <w:rFonts w:ascii="Arial" w:hAnsi="Arial" w:cs="Arial"/>
         </w:rPr>
-        <w:t>When a graphic element is selected, its JSON code is shown to edit texts, colours, sizes, etc.</w:t>
+        <w:t>When a graphic element is selected, its structure and fields are shown in the Properties tab and its code in the JSON tab, to edit texts, colours, sizes, etc., and to add, move or remove elements.</w:t>
       </w:r>
     </w:p>
     <w:p>
@@ -15539,7 +15746,7 @@
         <w:rFonts w:ascii="Symbol" w:hAnsi="Symbol" w:hint="default"/>
       </w:rPr>
     </w:lvl>
-    <w:lvl w:ilvl="1" w:tplc="0C0A0003" w:tentative="1">
+    <w:lvl w:ilvl="1" w:tplc="0C0A0003">
       <w:start w:val="1"/>
       <w:numFmt w:val="bullet"/>
       <w:lvlText w:val="o"/>

</xml_diff>

<commit_message>
has been updated the web configurator build on the android assets with the new element editor, the release apk in the installer, and corrected the support note and the test suite about the pending changes of the editor and the Testing connection way needed by the Testing tab
Co-Authored-By: Claude Opus 5.5 <noreply@anthropic.com>
</commit_message>
<xml_diff>
--- a/docs/Support note.docx
+++ b/docs/Support note.docx
@@ -4596,7 +4596,6 @@
         <w:rPr>
           <w:rFonts w:ascii="Arial" w:hAnsi="Arial" w:cs="Arial"/>
         </w:rPr>
-        <w:lastRenderedPageBreak/>
         <w:t>General description</w:t>
       </w:r>
       <w:bookmarkEnd w:id="4"/>
@@ -5076,7 +5075,6 @@
         <w:rPr>
           <w:rFonts w:ascii="Arial" w:hAnsi="Arial" w:cs="Arial"/>
         </w:rPr>
-        <w:lastRenderedPageBreak/>
         <w:t xml:space="preserve">Port </w:t>
       </w:r>
       <w:r>
@@ -5318,7 +5316,6 @@
               <w:rPr>
                 <w:rFonts w:ascii="Arial" w:hAnsi="Arial" w:cs="Arial"/>
               </w:rPr>
-              <w:lastRenderedPageBreak/>
               <w:t xml:space="preserve">To access the configuration files or the logs on </w:t>
             </w:r>
             <w:r>
@@ -5395,7 +5392,6 @@
                 <w:sz w:val="22"/>
                 <w:szCs w:val="22"/>
               </w:rPr>
-              <w:lastRenderedPageBreak/>
               <w:t xml:space="preserve">WinSCP FTP client accessing the private folder of the application to view the logs or the configuration files (example: 192.168.209.52) on port 2122 with the user: </w:t>
             </w:r>
             <w:r>
@@ -5590,7 +5586,6 @@
                 <w:rFonts w:ascii="Arial" w:hAnsi="Arial" w:cs="Arial"/>
                 <w:noProof/>
               </w:rPr>
-              <w:lastRenderedPageBreak/>
               <w:drawing>
                 <wp:inline distT="0" distB="0" distL="0" distR="0" wp14:anchorId="7F26BD94" wp14:editId="0C43D180">
                   <wp:extent cx="5731510" cy="1916430"/>
@@ -5992,14 +5987,7 @@
         <w:rPr>
           <w:rFonts w:ascii="Arial" w:hAnsi="Arial" w:cs="Arial"/>
         </w:rPr>
-        <w:t xml:space="preserve">The web configurator is the central tool for the maintenance and remote customisation of the application installed on the lane monitors. It allows modifying the connection parameters, managing configurations and resources, editing and testing screens and sharing settings </w:t>
-      </w:r>
-      <w:r>
-        <w:rPr>
-          <w:rFonts w:ascii="Arial" w:hAnsi="Arial" w:cs="Arial"/>
-        </w:rPr>
-        <w:lastRenderedPageBreak/>
-        <w:t>between different devices, all through an interface accessible from any computer connected to the same local network.</w:t>
+        <w:t>The web configurator is the central tool for the maintenance and remote customisation of the application installed on the lane monitors. It allows modifying the connection parameters, managing configurations and resources, editing and testing screens and sharing settings between different devices, all through an interface accessible from any computer connected to the same local network.</w:t>
       </w:r>
     </w:p>
     <w:p>
@@ -6738,7 +6726,6 @@
       </w:pPr>
       <w:bookmarkStart w:id="12" w:name="_Toc241621378"/>
       <w:r>
-        <w:lastRenderedPageBreak/>
         <w:t>Description of the main sections (tabs)</w:t>
       </w:r>
       <w:bookmarkEnd w:id="12"/>
@@ -7090,7 +7077,6 @@
                 <w:rFonts w:ascii="Arial" w:hAnsi="Arial" w:cs="Arial"/>
                 <w:noProof/>
               </w:rPr>
-              <w:lastRenderedPageBreak/>
               <w:drawing>
                 <wp:inline distT="0" distB="0" distL="0" distR="0" wp14:anchorId="79096618" wp14:editId="789E9456">
                   <wp:extent cx="5731510" cy="3884690"/>
@@ -7338,7 +7324,6 @@
         </w:numPr>
       </w:pPr>
       <w:r>
-        <w:lastRenderedPageBreak/>
         <w:t>Export</w:t>
       </w:r>
     </w:p>
@@ -7751,7 +7736,6 @@
           <w:b/>
           <w:bCs/>
         </w:rPr>
-        <w:lastRenderedPageBreak/>
         <w:t>Screen preview (centre):</w:t>
       </w:r>
       <w:r>
@@ -7984,7 +7968,13 @@
         <w:rPr>
           <w:rFonts w:ascii="Arial" w:hAnsi="Arial" w:cs="Arial"/>
         </w:rPr>
-        <w:t xml:space="preserve"> Selecting another screen in the Screen list discards the changes that were not saved with "UPDATE".</w:t>
+        <w:t xml:space="preserve"> </w:t>
+      </w:r>
+      <w:r>
+        <w:rPr>
+          <w:rFonts w:ascii="Arial" w:hAnsi="Arial" w:cs="Arial"/>
+        </w:rPr>
+        <w:t>The changes applied to the screen preview are kept while the tab is open, and the next "UPDATE" saves all of them. Leaving the tab or reloading the page discards the changes that were not saved.</w:t>
       </w:r>
     </w:p>
     <w:p>
@@ -11345,6 +11335,7 @@
           <w:tcW w:w="3472" w:type="dxa"/>
           <w:vAlign w:val="bottom"/>
         </w:tcPr>
+        <w:bookmarkStart w:id="14" w:name="_Hlk199416307"/>
         <w:p>
           <w:pPr>
             <w:pStyle w:val="TextoMemorando"/>
@@ -11353,7 +11344,6 @@
               <w:rFonts w:ascii="Arial" w:hAnsi="Arial" w:cs="Arial"/>
             </w:rPr>
           </w:pPr>
-          <w:bookmarkStart w:id="14" w:name="_Hlk199416307"/>
           <w:r>
             <w:rPr>
               <w:noProof/>

</xml_diff>

<commit_message>
docs: update Support note screenshots to v2.1.9 and document Text element, translations and editing steps
Co-Authored-By: Claude Sonnet 5.5 <noreply@anthropic.com>
</commit_message>
<xml_diff>
--- a/docs/Support note.docx
+++ b/docs/Support note.docx
@@ -911,7 +911,7 @@
                 <w:rFonts w:ascii="Arial" w:hAnsi="Arial" w:cs="Arial"/>
                 <w:lang w:val="en-US" w:eastAsia="es-ES_tradnl"/>
               </w:rPr>
-              <w:t>30/09/2026</w:t>
+              <w:t>19/10/2026</w:t>
             </w:r>
           </w:p>
         </w:tc>
@@ -1494,6 +1494,123 @@
                 <w:sz w:val="22"/>
               </w:rPr>
               <w:t>Edit current config tab: new element editor with a Properties tab (structure tree to add, move and remove elements, and fields by element type) and a JSON tab.</w:t>
+            </w:r>
+          </w:p>
+        </w:tc>
+      </w:tr>
+      <w:tr>
+        <w:tc>
+          <w:tcPr>
+            <w:tcW w:w="1231" w:type="dxa"/>
+            <w:tcBorders>
+              <w:left w:val="single" w:sz="12" w:space="0" w:color="auto"/>
+            </w:tcBorders>
+          </w:tcPr>
+          <w:p>
+            <w:pPr>
+              <w:pStyle w:val="TextoMemorando"/>
+              <w:jc w:val="center"/>
+              <w:rPr>
+                <w:rFonts w:ascii="Arial" w:hAnsi="Arial" w:cs="Arial"/>
+                <w:sz w:val="22"/>
+              </w:rPr>
+            </w:pPr>
+            <w:r>
+              <w:rPr>
+                <w:rFonts w:ascii="Arial" w:hAnsi="Arial" w:cs="Arial"/>
+                <w:sz w:val="22"/>
+              </w:rPr>
+              <w:t>4</w:t>
+            </w:r>
+          </w:p>
+        </w:tc>
+        <w:tc>
+          <w:tcPr>
+            <w:tcW w:w="1318" w:type="dxa"/>
+          </w:tcPr>
+          <w:p>
+            <w:pPr>
+              <w:pStyle w:val="TextoMemorando"/>
+              <w:jc w:val="center"/>
+              <w:rPr>
+                <w:rFonts w:ascii="Arial" w:hAnsi="Arial" w:cs="Arial"/>
+                <w:sz w:val="22"/>
+              </w:rPr>
+            </w:pPr>
+            <w:r>
+              <w:rPr>
+                <w:rFonts w:ascii="Arial" w:hAnsi="Arial" w:cs="Arial"/>
+                <w:sz w:val="22"/>
+              </w:rPr>
+              <w:t>19/10/2026</w:t>
+            </w:r>
+          </w:p>
+        </w:tc>
+        <w:tc>
+          <w:tcPr>
+            <w:tcW w:w="1237" w:type="dxa"/>
+          </w:tcPr>
+          <w:p>
+            <w:pPr>
+              <w:pStyle w:val="TextoMemorando"/>
+              <w:jc w:val="center"/>
+              <w:rPr>
+                <w:rFonts w:ascii="Arial" w:hAnsi="Arial" w:cs="Arial"/>
+                <w:sz w:val="22"/>
+              </w:rPr>
+            </w:pPr>
+            <w:r>
+              <w:rPr>
+                <w:rFonts w:ascii="Arial" w:hAnsi="Arial" w:cs="Arial"/>
+                <w:sz w:val="22"/>
+              </w:rPr>
+              <w:t>DVERA / Claude</w:t>
+            </w:r>
+          </w:p>
+        </w:tc>
+        <w:tc>
+          <w:tcPr>
+            <w:tcW w:w="1255" w:type="dxa"/>
+          </w:tcPr>
+          <w:p>
+            <w:pPr>
+              <w:pStyle w:val="TextoMemorando"/>
+              <w:jc w:val="center"/>
+              <w:rPr>
+                <w:rFonts w:ascii="Arial" w:hAnsi="Arial" w:cs="Arial"/>
+                <w:sz w:val="22"/>
+              </w:rPr>
+            </w:pPr>
+            <w:r>
+              <w:rPr>
+                <w:rFonts w:ascii="Arial" w:hAnsi="Arial" w:cs="Arial"/>
+                <w:sz w:val="22"/>
+              </w:rPr>
+              <w:t>3-15</w:t>
+            </w:r>
+          </w:p>
+        </w:tc>
+        <w:tc>
+          <w:tcPr>
+            <w:tcW w:w="4426" w:type="dxa"/>
+            <w:tcBorders>
+              <w:right w:val="single" w:sz="12" w:space="0" w:color="auto"/>
+            </w:tcBorders>
+          </w:tcPr>
+          <w:p>
+            <w:pPr>
+              <w:pStyle w:val="TextoMemorando"/>
+              <w:rPr>
+                <w:rFonts w:ascii="Arial" w:hAnsi="Arial" w:cs="Arial"/>
+                <w:sz w:val="22"/>
+              </w:rPr>
+            </w:pPr>
+            <w:r>
+              <w:rPr>
+                <w:rFonts w:ascii="Arial" w:hAnsi="Arial" w:cs="Arial"/>
+                <w:sz w:val="22"/>
+              </w:rPr>
+              <w:t>Screenshots updated to application version 2.1.9. Documented: Text element properties and translations (language rotation and keys), password dialog, Connection details (video frame, Socket mode, text size scale), Dashboard list, Export/Import templates, element IDs, Share config indicator, Resources, Testing and the DIT message with the CardClass validation example.</w:t>
             </w:r>
           </w:p>
         </w:tc>
@@ -3810,12 +3927,6 @@
               <w:lang w:val="en-US"/>
             </w:rPr>
             <w:t>Content</w:t>
-          </w:r>
-          <w:r>
-            <w:rPr>
-              <w:rFonts w:ascii="Arial" w:hAnsi="Arial" w:cs="Arial"/>
-              <w:lang w:val="en-US"/>
-            </w:rPr>
             <w:tab/>
           </w:r>
         </w:p>
@@ -3869,40 +3980,10 @@
                 <w:webHidden/>
               </w:rPr>
               <w:tab/>
-            </w:r>
-            <w:r>
-              <w:rPr>
-                <w:webHidden/>
-              </w:rPr>
               <w:fldChar w:fldCharType="begin"/>
-            </w:r>
-            <w:r>
-              <w:rPr>
-                <w:webHidden/>
-              </w:rPr>
               <w:instrText xml:space="preserve"> PAGEREF _Toc241621370 \h </w:instrText>
-            </w:r>
-            <w:r>
-              <w:rPr>
-                <w:webHidden/>
-              </w:rPr>
-            </w:r>
-            <w:r>
-              <w:rPr>
-                <w:webHidden/>
-              </w:rPr>
               <w:fldChar w:fldCharType="separate"/>
-            </w:r>
-            <w:r>
-              <w:rPr>
-                <w:webHidden/>
-              </w:rPr>
               <w:t>4</w:t>
-            </w:r>
-            <w:r>
-              <w:rPr>
-                <w:webHidden/>
-              </w:rPr>
               <w:fldChar w:fldCharType="end"/>
             </w:r>
           </w:hyperlink>
@@ -3932,40 +4013,10 @@
                 <w:webHidden/>
               </w:rPr>
               <w:tab/>
-            </w:r>
-            <w:r>
-              <w:rPr>
-                <w:webHidden/>
-              </w:rPr>
               <w:fldChar w:fldCharType="begin"/>
-            </w:r>
-            <w:r>
-              <w:rPr>
-                <w:webHidden/>
-              </w:rPr>
               <w:instrText xml:space="preserve"> PAGEREF _Toc241621371 \h </w:instrText>
-            </w:r>
-            <w:r>
-              <w:rPr>
-                <w:webHidden/>
-              </w:rPr>
-            </w:r>
-            <w:r>
-              <w:rPr>
-                <w:webHidden/>
-              </w:rPr>
               <w:fldChar w:fldCharType="separate"/>
-            </w:r>
-            <w:r>
-              <w:rPr>
-                <w:webHidden/>
-              </w:rPr>
               <w:t>4</w:t>
-            </w:r>
-            <w:r>
-              <w:rPr>
-                <w:webHidden/>
-              </w:rPr>
               <w:fldChar w:fldCharType="end"/>
             </w:r>
           </w:hyperlink>
@@ -3995,40 +4046,10 @@
                 <w:webHidden/>
               </w:rPr>
               <w:tab/>
-            </w:r>
-            <w:r>
-              <w:rPr>
-                <w:webHidden/>
-              </w:rPr>
               <w:fldChar w:fldCharType="begin"/>
-            </w:r>
-            <w:r>
-              <w:rPr>
-                <w:webHidden/>
-              </w:rPr>
               <w:instrText xml:space="preserve"> PAGEREF _Toc241621372 \h </w:instrText>
-            </w:r>
-            <w:r>
-              <w:rPr>
-                <w:webHidden/>
-              </w:rPr>
-            </w:r>
-            <w:r>
-              <w:rPr>
-                <w:webHidden/>
-              </w:rPr>
               <w:fldChar w:fldCharType="separate"/>
-            </w:r>
-            <w:r>
-              <w:rPr>
-                <w:webHidden/>
-              </w:rPr>
               <w:t>4</w:t>
-            </w:r>
-            <w:r>
-              <w:rPr>
-                <w:webHidden/>
-              </w:rPr>
               <w:fldChar w:fldCharType="end"/>
             </w:r>
           </w:hyperlink>
@@ -4058,40 +4079,10 @@
                 <w:webHidden/>
               </w:rPr>
               <w:tab/>
-            </w:r>
-            <w:r>
-              <w:rPr>
-                <w:webHidden/>
-              </w:rPr>
               <w:fldChar w:fldCharType="begin"/>
-            </w:r>
-            <w:r>
-              <w:rPr>
-                <w:webHidden/>
-              </w:rPr>
               <w:instrText xml:space="preserve"> PAGEREF _Toc241621373 \h </w:instrText>
-            </w:r>
-            <w:r>
-              <w:rPr>
-                <w:webHidden/>
-              </w:rPr>
-            </w:r>
-            <w:r>
-              <w:rPr>
-                <w:webHidden/>
-              </w:rPr>
               <w:fldChar w:fldCharType="separate"/>
-            </w:r>
-            <w:r>
-              <w:rPr>
-                <w:webHidden/>
-              </w:rPr>
               <w:t>4</w:t>
-            </w:r>
-            <w:r>
-              <w:rPr>
-                <w:webHidden/>
-              </w:rPr>
               <w:fldChar w:fldCharType="end"/>
             </w:r>
           </w:hyperlink>
@@ -4139,40 +4130,10 @@
                 <w:webHidden/>
               </w:rPr>
               <w:tab/>
-            </w:r>
-            <w:r>
-              <w:rPr>
-                <w:webHidden/>
-              </w:rPr>
               <w:fldChar w:fldCharType="begin"/>
-            </w:r>
-            <w:r>
-              <w:rPr>
-                <w:webHidden/>
-              </w:rPr>
               <w:instrText xml:space="preserve"> PAGEREF _Toc241621374 \h </w:instrText>
-            </w:r>
-            <w:r>
-              <w:rPr>
-                <w:webHidden/>
-              </w:rPr>
-            </w:r>
-            <w:r>
-              <w:rPr>
-                <w:webHidden/>
-              </w:rPr>
               <w:fldChar w:fldCharType="separate"/>
-            </w:r>
-            <w:r>
-              <w:rPr>
-                <w:webHidden/>
-              </w:rPr>
               <w:t>4</w:t>
-            </w:r>
-            <w:r>
-              <w:rPr>
-                <w:webHidden/>
-              </w:rPr>
               <w:fldChar w:fldCharType="end"/>
             </w:r>
           </w:hyperlink>
@@ -4205,46 +4166,10 @@
                 <w:webHidden/>
               </w:rPr>
               <w:tab/>
-            </w:r>
-            <w:r>
-              <w:rPr>
-                <w:noProof/>
-                <w:webHidden/>
-              </w:rPr>
               <w:fldChar w:fldCharType="begin"/>
-            </w:r>
-            <w:r>
-              <w:rPr>
-                <w:noProof/>
-                <w:webHidden/>
-              </w:rPr>
               <w:instrText xml:space="preserve"> PAGEREF _Toc241621375 \h </w:instrText>
-            </w:r>
-            <w:r>
-              <w:rPr>
-                <w:noProof/>
-                <w:webHidden/>
-              </w:rPr>
-            </w:r>
-            <w:r>
-              <w:rPr>
-                <w:noProof/>
-                <w:webHidden/>
-              </w:rPr>
               <w:fldChar w:fldCharType="separate"/>
-            </w:r>
-            <w:r>
-              <w:rPr>
-                <w:noProof/>
-                <w:webHidden/>
-              </w:rPr>
               <w:t>4</w:t>
-            </w:r>
-            <w:r>
-              <w:rPr>
-                <w:noProof/>
-                <w:webHidden/>
-              </w:rPr>
               <w:fldChar w:fldCharType="end"/>
             </w:r>
           </w:hyperlink>
@@ -4292,40 +4217,10 @@
                 <w:webHidden/>
               </w:rPr>
               <w:tab/>
-            </w:r>
-            <w:r>
-              <w:rPr>
-                <w:webHidden/>
-              </w:rPr>
               <w:fldChar w:fldCharType="begin"/>
-            </w:r>
-            <w:r>
-              <w:rPr>
-                <w:webHidden/>
-              </w:rPr>
               <w:instrText xml:space="preserve"> PAGEREF _Toc241621376 \h </w:instrText>
-            </w:r>
-            <w:r>
-              <w:rPr>
-                <w:webHidden/>
-              </w:rPr>
-            </w:r>
-            <w:r>
-              <w:rPr>
-                <w:webHidden/>
-              </w:rPr>
               <w:fldChar w:fldCharType="separate"/>
-            </w:r>
-            <w:r>
-              <w:rPr>
-                <w:webHidden/>
-              </w:rPr>
               <w:t>7</w:t>
-            </w:r>
-            <w:r>
-              <w:rPr>
-                <w:webHidden/>
-              </w:rPr>
               <w:fldChar w:fldCharType="end"/>
             </w:r>
           </w:hyperlink>
@@ -4358,46 +4253,10 @@
                 <w:webHidden/>
               </w:rPr>
               <w:tab/>
-            </w:r>
-            <w:r>
-              <w:rPr>
-                <w:noProof/>
-                <w:webHidden/>
-              </w:rPr>
               <w:fldChar w:fldCharType="begin"/>
-            </w:r>
-            <w:r>
-              <w:rPr>
-                <w:noProof/>
-                <w:webHidden/>
-              </w:rPr>
               <w:instrText xml:space="preserve"> PAGEREF _Toc241621377 \h </w:instrText>
-            </w:r>
-            <w:r>
-              <w:rPr>
-                <w:noProof/>
-                <w:webHidden/>
-              </w:rPr>
-            </w:r>
-            <w:r>
-              <w:rPr>
-                <w:noProof/>
-                <w:webHidden/>
-              </w:rPr>
               <w:fldChar w:fldCharType="separate"/>
-            </w:r>
-            <w:r>
-              <w:rPr>
-                <w:noProof/>
-                <w:webHidden/>
-              </w:rPr>
               <w:t>8</w:t>
-            </w:r>
-            <w:r>
-              <w:rPr>
-                <w:noProof/>
-                <w:webHidden/>
-              </w:rPr>
               <w:fldChar w:fldCharType="end"/>
             </w:r>
           </w:hyperlink>
@@ -4429,46 +4288,10 @@
                 <w:webHidden/>
               </w:rPr>
               <w:tab/>
-            </w:r>
-            <w:r>
-              <w:rPr>
-                <w:noProof/>
-                <w:webHidden/>
-              </w:rPr>
               <w:fldChar w:fldCharType="begin"/>
-            </w:r>
-            <w:r>
-              <w:rPr>
-                <w:noProof/>
-                <w:webHidden/>
-              </w:rPr>
               <w:instrText xml:space="preserve"> PAGEREF _Toc241621378 \h </w:instrText>
-            </w:r>
-            <w:r>
-              <w:rPr>
-                <w:noProof/>
-                <w:webHidden/>
-              </w:rPr>
-            </w:r>
-            <w:r>
-              <w:rPr>
-                <w:noProof/>
-                <w:webHidden/>
-              </w:rPr>
               <w:fldChar w:fldCharType="separate"/>
-            </w:r>
-            <w:r>
-              <w:rPr>
-                <w:noProof/>
-                <w:webHidden/>
-              </w:rPr>
               <w:t>9</w:t>
-            </w:r>
-            <w:r>
-              <w:rPr>
-                <w:noProof/>
-                <w:webHidden/>
-              </w:rPr>
               <w:fldChar w:fldCharType="end"/>
             </w:r>
           </w:hyperlink>
@@ -4500,46 +4323,10 @@
                 <w:webHidden/>
               </w:rPr>
               <w:tab/>
-            </w:r>
-            <w:r>
-              <w:rPr>
-                <w:noProof/>
-                <w:webHidden/>
-              </w:rPr>
               <w:fldChar w:fldCharType="begin"/>
-            </w:r>
-            <w:r>
-              <w:rPr>
-                <w:noProof/>
-                <w:webHidden/>
-              </w:rPr>
               <w:instrText xml:space="preserve"> PAGEREF _Toc241621379 \h </w:instrText>
-            </w:r>
-            <w:r>
-              <w:rPr>
-                <w:noProof/>
-                <w:webHidden/>
-              </w:rPr>
-            </w:r>
-            <w:r>
-              <w:rPr>
-                <w:noProof/>
-                <w:webHidden/>
-              </w:rPr>
               <w:fldChar w:fldCharType="separate"/>
-            </w:r>
-            <w:r>
-              <w:rPr>
-                <w:noProof/>
-                <w:webHidden/>
-              </w:rPr>
               <w:t>15</w:t>
-            </w:r>
-            <w:r>
-              <w:rPr>
-                <w:noProof/>
-                <w:webHidden/>
-              </w:rPr>
               <w:fldChar w:fldCharType="end"/>
             </w:r>
           </w:hyperlink>
@@ -6095,7 +5882,25 @@
         <w:rPr>
           <w:rFonts w:ascii="Arial" w:hAnsi="Arial" w:cs="Arial"/>
         </w:rPr>
-        <w:t>Once authenticated, a side menu with eight main tabs is shown. At the bottom of the side menu you can select the IP address of the monitor to configure, and the application version is shown.</w:t>
+        <w:t>In the password dialog, type the password in the Password field and press ACCEPT. CANCEL or the x button closes the dialog without entering.</w:t>
+      </w:r>
+    </w:p>
+    <w:p>
+      <w:pPr>
+        <w:pStyle w:val="ListParagraph"/>
+        <w:numPr>
+          <w:ilvl w:val="0"/>
+          <w:numId w:val="5"/>
+        </w:numPr>
+        <w:rPr>
+          <w:rFonts w:ascii="Arial" w:hAnsi="Arial" w:cs="Arial"/>
+        </w:rPr>
+      </w:pPr>
+      <w:r>
+        <w:rPr>
+          <w:rFonts w:ascii="Arial" w:hAnsi="Arial" w:cs="Arial"/>
+        </w:rPr>
+        <w:t>Once authenticated, a side menu with eight main tabs is shown. At the bottom of the side menu you can select the IP address of the monitor to configure, and the application version is shown (for example, Version: 2.1.9).</w:t>
       </w:r>
     </w:p>
     <w:tbl>
@@ -6542,7 +6347,7 @@
               </w:rPr>
               <w:drawing>
                 <wp:inline distT="0" distB="0" distL="0" distR="0" wp14:anchorId="10EF3EB0" wp14:editId="4999E05D">
-                  <wp:extent cx="3828197" cy="1787312"/>
+                  <wp:extent cx="3828197" cy="1772494"/>
                   <wp:effectExtent l="0" t="0" r="0" b="0"/>
                   <wp:docPr id="723577720" name="Imagen 1"/>
                   <wp:cNvGraphicFramePr>
@@ -6563,7 +6368,7 @@
                         <pic:spPr bwMode="auto">
                           <a:xfrm>
                             <a:off x="0" y="0"/>
-                            <a:ext cx="3828197" cy="1787312"/>
+                            <a:ext cx="3828197" cy="1772494"/>
                           </a:xfrm>
                           <a:prstGeom prst="rect">
                             <a:avLst/>
@@ -6610,7 +6415,7 @@
                   <wp:positionV relativeFrom="paragraph">
                     <wp:posOffset>10</wp:posOffset>
                   </wp:positionV>
-                  <wp:extent cx="1083558" cy="2510014"/>
+                  <wp:extent cx="1083558" cy="2278568"/>
                   <wp:effectExtent l="0" t="0" r="0" b="0"/>
                   <wp:wrapSquare wrapText="bothSides"/>
                   <wp:docPr id="530686381" name="Imagen 1"/>
@@ -6639,7 +6444,7 @@
                         <pic:spPr>
                           <a:xfrm>
                             <a:off x="0" y="0"/>
-                            <a:ext cx="1083558" cy="2510014"/>
+                            <a:ext cx="1083558" cy="2278568"/>
                           </a:xfrm>
                           <a:prstGeom prst="rect">
                             <a:avLst/>
@@ -6831,7 +6636,7 @@
         <w:rPr>
           <w:rFonts w:ascii="Arial" w:hAnsi="Arial" w:cs="Arial"/>
         </w:rPr>
-        <w:t>Field used only in SignalR mode.</w:t>
+        <w:t>Field used only in SignalR mode. In Socket mode only Terminal IP and Port are used and the API field is left empty.</w:t>
       </w:r>
     </w:p>
     <w:p>
@@ -6857,7 +6662,7 @@
         <w:rPr>
           <w:rFonts w:ascii="Arial" w:hAnsi="Arial" w:cs="Arial"/>
         </w:rPr>
-        <w:t xml:space="preserve"> Time in seconds to alternate between the languages configured on screen.</w:t>
+        <w:t xml:space="preserve"> Time in seconds that each language stays on screen before switching to the next one when the texts have translations (see Text element and translations).</w:t>
       </w:r>
     </w:p>
     <w:p>
@@ -6883,7 +6688,7 @@
         <w:rPr>
           <w:rFonts w:ascii="Arial" w:hAnsi="Arial" w:cs="Arial"/>
         </w:rPr>
-        <w:t xml:space="preserve"> Shows a video frame at the bottom of the screen. The videos must be stored in the folder </w:t>
+        <w:t xml:space="preserve"> Shows a video frame at the bottom of the screen that takes up 25% of it. It plays automatically and in an endless loop the videos stored in the folder </w:t>
       </w:r>
       <w:r>
         <w:rPr>
@@ -6891,7 +6696,7 @@
           <w:i/>
           <w:iCs/>
         </w:rPr>
-        <w:t>Videos/Dashboard/</w:t>
+        <w:t>Dashboard/videos/ of the monitor file storage</w:t>
       </w:r>
       <w:r>
         <w:rPr>
@@ -6923,7 +6728,7 @@
         <w:rPr>
           <w:rFonts w:ascii="Arial" w:hAnsi="Arial" w:cs="Arial"/>
         </w:rPr>
-        <w:t xml:space="preserve"> Adjusts the overall size of the texts shown on screen.</w:t>
+        <w:t xml:space="preserve"> Adjusts the overall size of the texts shown on screen. It depends on the size and the pixel density of the monitor. Recommended values: 9 for 43'' monitors, 10 for 55'' monitors with Android 9 and 12 for 55'' monitors with Android 12 or higher.</w:t>
       </w:r>
     </w:p>
     <w:p>
@@ -7079,7 +6884,7 @@
               </w:rPr>
               <w:drawing>
                 <wp:inline distT="0" distB="0" distL="0" distR="0" wp14:anchorId="79096618" wp14:editId="789E9456">
-                  <wp:extent cx="5731510" cy="3884690"/>
+                  <wp:extent cx="5731510" cy="3948374"/>
                   <wp:effectExtent l="0" t="0" r="0" b="0"/>
                   <wp:docPr id="1441512087" name="Imagen 1"/>
                   <wp:cNvGraphicFramePr>
@@ -7101,7 +6906,7 @@
                         <pic:spPr>
                           <a:xfrm>
                             <a:off x="0" y="0"/>
-                            <a:ext cx="5731510" cy="3884690"/>
+                            <a:ext cx="5731510" cy="3948374"/>
                           </a:xfrm>
                           <a:prstGeom prst="rect">
                             <a:avLst/>
@@ -7178,7 +6983,7 @@
         <w:rPr>
           <w:rFonts w:ascii="Arial" w:hAnsi="Arial" w:cs="Arial"/>
         </w:rPr>
-        <w:t>Manages a list of lane monitors for centralised administration:</w:t>
+        <w:t>Manages a list of lane monitors for centralised administration. The application is installed on monitors located at the entrances and exits of the car parks, and all the entrances usually share the same configuration, as well as all the exits. Registering the monitors here makes it easier to identify them and to share the configuration between them:</w:t>
       </w:r>
     </w:p>
     <w:p>
@@ -7196,7 +7001,7 @@
         <w:rPr>
           <w:rFonts w:ascii="Arial" w:hAnsi="Arial" w:cs="Arial"/>
         </w:rPr>
-        <w:t>Adds new monitors with their IP address, a custom name and, optionally, the IP address of the associated terminal.</w:t>
+        <w:t>Adds new monitors with their IP address (Dashboard IP), a custom name (Custom name) and, optionally, the IP address of the associated terminal (Terminal IP). The terminal is the device that sends the data to the monitor (licence plate read, barrier opened, etc.); this field is optional, it can be saved empty and it is only informative. The SAVE button is enabled when the fields are filled. The list below shows the Custom name, Dashboard IP and Terminal IP of each monitor; the first row, Current device, is the monitor that is being configured.</w:t>
       </w:r>
     </w:p>
     <w:p>
@@ -7214,7 +7019,7 @@
         <w:rPr>
           <w:rFonts w:ascii="Arial" w:hAnsi="Arial" w:cs="Arial"/>
         </w:rPr>
-        <w:t>Allows replicating the current configuration to other monitors of the list.</w:t>
+        <w:t>The record Current device is the host monitor (the one that runs the web server), so it has no edit or delete buttons. The configuration is replicated to the other monitors of the list from the Share config tab.</w:t>
       </w:r>
     </w:p>
     <w:tbl>
@@ -7245,7 +7050,7 @@
               </w:rPr>
               <w:drawing>
                 <wp:inline distT="0" distB="0" distL="0" distR="0" wp14:anchorId="13711D2A" wp14:editId="5F46FC0D">
-                  <wp:extent cx="5602406" cy="2615657"/>
+                  <wp:extent cx="5602406" cy="2593971"/>
                   <wp:effectExtent l="0" t="0" r="0" b="0"/>
                   <wp:docPr id="820662724" name="Imagen 1"/>
                   <wp:cNvGraphicFramePr>
@@ -7267,7 +7072,7 @@
                         <pic:spPr>
                           <a:xfrm>
                             <a:off x="0" y="0"/>
-                            <a:ext cx="5602406" cy="2615657"/>
+                            <a:ext cx="5602406" cy="2593971"/>
                           </a:xfrm>
                           <a:prstGeom prst="rect">
                             <a:avLst/>
@@ -7355,7 +7160,7 @@
         <w:rPr>
           <w:rFonts w:ascii="Arial" w:hAnsi="Arial" w:cs="Arial"/>
         </w:rPr>
-        <w:t>Shows and downloads the active configuration.</w:t>
+        <w:t>Shows and downloads the current configuration (Current config): the configuration stored in the monitor that runs the web server, which is displayed in JSON format in the read-only File content area.</w:t>
       </w:r>
     </w:p>
     <w:p>
@@ -7373,7 +7178,25 @@
         <w:rPr>
           <w:rFonts w:ascii="Arial" w:hAnsi="Arial" w:cs="Arial"/>
         </w:rPr>
-        <w:t>Downloads templates for different scenarios (entry with ticket, ticketless exit, etc.) from a drop-down list.</w:t>
+        <w:t>Downloads templates for different scenarios from a drop-down list. They are predefined configurations designed for specific customers: Entry with ticket, Ticket-less entry, Ticket-less exit, Intertraffic entry, Intertraffic exit and Saba Pau Claris exit.</w:t>
+      </w:r>
+    </w:p>
+    <w:p>
+      <w:pPr>
+        <w:pStyle w:val="ListParagraph"/>
+        <w:numPr>
+          <w:ilvl w:val="0"/>
+          <w:numId w:val="5"/>
+        </w:numPr>
+        <w:rPr>
+          <w:rFonts w:ascii="Arial" w:hAnsi="Arial" w:cs="Arial"/>
+        </w:rPr>
+      </w:pPr>
+      <w:r>
+        <w:rPr>
+          <w:rFonts w:ascii="Arial" w:hAnsi="Arial" w:cs="Arial"/>
+        </w:rPr>
+        <w:t>Selecting another option of the list changes the configuration that is shown in the File content area and that is downloaded. DOWNLOAD FILE saves it as a JSON file on the computer.</w:t>
       </w:r>
     </w:p>
     <w:tbl>
@@ -7405,7 +7228,7 @@
               </w:rPr>
               <w:drawing>
                 <wp:inline distT="0" distB="0" distL="0" distR="0" wp14:anchorId="58A4493C" wp14:editId="019C982B">
-                  <wp:extent cx="4974609" cy="2322550"/>
+                  <wp:extent cx="4974609" cy="4012851"/>
                   <wp:effectExtent l="0" t="0" r="0" b="0"/>
                   <wp:docPr id="1148654812" name="Imagen 1"/>
                   <wp:cNvGraphicFramePr>
@@ -7427,7 +7250,7 @@
                         <pic:spPr>
                           <a:xfrm>
                             <a:off x="0" y="0"/>
-                            <a:ext cx="4974609" cy="2322550"/>
+                            <a:ext cx="4974609" cy="4012851"/>
                           </a:xfrm>
                           <a:prstGeom prst="rect">
                             <a:avLst/>
@@ -7508,7 +7331,7 @@
         <w:rPr>
           <w:rFonts w:ascii="Arial" w:hAnsi="Arial" w:cs="Arial"/>
         </w:rPr>
-        <w:t>Upload a configuration file or select a template from the list.</w:t>
+        <w:t>Select a template from the Default templates drop-down list (the same six templates as in Export) or press UPLOAD FILES to load a configuration file. The content is shown in the File content area.</w:t>
       </w:r>
     </w:p>
     <w:p>
@@ -7527,6 +7350,24 @@
           <w:rFonts w:ascii="Arial" w:hAnsi="Arial" w:cs="Arial"/>
         </w:rPr>
         <w:t>Edit the configuration before applying it.</w:t>
+      </w:r>
+    </w:p>
+    <w:p>
+      <w:pPr>
+        <w:pStyle w:val="ListParagraph"/>
+        <w:numPr>
+          <w:ilvl w:val="0"/>
+          <w:numId w:val="31"/>
+        </w:numPr>
+        <w:rPr>
+          <w:rFonts w:ascii="Arial" w:hAnsi="Arial" w:cs="Arial"/>
+        </w:rPr>
+      </w:pPr>
+      <w:r>
+        <w:rPr>
+          <w:rFonts w:ascii="Arial" w:hAnsi="Arial" w:cs="Arial"/>
+        </w:rPr>
+        <w:t xml:space="preserve">If the file does not have a valid format, a modal window informs that the document has an error. The SAVE button does not ask for any confirmation.</w:t>
       </w:r>
     </w:p>
     <w:p>
@@ -7598,7 +7439,7 @@
               </w:rPr>
               <w:drawing>
                 <wp:inline distT="0" distB="0" distL="0" distR="0" wp14:anchorId="13B12CA0" wp14:editId="1B4F138C">
-                  <wp:extent cx="5390865" cy="2516892"/>
+                  <wp:extent cx="5390865" cy="2496026"/>
                   <wp:effectExtent l="0" t="0" r="0" b="0"/>
                   <wp:docPr id="1777724620" name="Imagen 1"/>
                   <wp:cNvGraphicFramePr>
@@ -7620,7 +7461,7 @@
                         <pic:spPr>
                           <a:xfrm>
                             <a:off x="0" y="0"/>
-                            <a:ext cx="5390865" cy="2516892"/>
+                            <a:ext cx="5390865" cy="2496026"/>
                           </a:xfrm>
                           <a:prstGeom prst="rect">
                             <a:avLst/>
@@ -7716,7 +7557,7 @@
         <w:rPr>
           <w:rFonts w:ascii="Arial" w:hAnsi="Arial" w:cs="Arial"/>
         </w:rPr>
-        <w:t xml:space="preserve"> shows the configured screens. Select one to load it in the screen preview.</w:t>
+        <w:t xml:space="preserve"> shows the configured screens (11 in the current configuration: IDLE, READING_PLATE, PLEASE_PROCEED, DLG_PAYMENT_REQUIRED, DLG_InicioCobroActual, USER, DLG_CARD_ERROR, IDLE_DISCONNECTED, DLG_BOOT, DLG_OUT_SERVICE and DLG_BLOCKED; scroll the list to see all of them). The screens depend on the configuration loaded from the Import tab (entry, exit, different customers, etc.). Select one to load it in the screen preview. While no element is selected, the editor shows the message Select an element on the screen preview to edit it and the UPDATE button is disabled; it is enabled when an element is selected.</w:t>
       </w:r>
     </w:p>
     <w:p>
@@ -7931,6 +7772,11 @@
     </w:p>
     <w:p>
       <w:pPr>
+        <w:pStyle w:val="ListParagraph"/>
+        <w:numPr>
+          <w:ilvl w:val="0"/>
+          <w:numId w:val="32"/>
+        </w:numPr>
         <w:rPr>
           <w:rFonts w:ascii="Arial" w:hAnsi="Arial" w:cs="Arial"/>
         </w:rPr>
@@ -7941,13 +7787,7 @@
           <w:b/>
           <w:bCs/>
         </w:rPr>
-        <w:t>Note:</w:t>
-      </w:r>
-      <w:r>
-        <w:rPr>
-          <w:rFonts w:ascii="Arial" w:hAnsi="Arial" w:cs="Arial"/>
-        </w:rPr>
-        <w:t xml:space="preserve"> If the confirmation message is cancelled, the changes are not saved on the monitor.</w:t>
+        <w:t xml:space="preserve">Element ID (item ID): the IDs of many elements do not match the text they show because the elements were reused between screens, and they are pending to be updated. Only a few IDs are used by the application, for example license-plate-value or amount-to-pay-value in DLG_InicioCobroActual, so they must not be changed.</w:t>
       </w:r>
     </w:p>
     <w:p>
@@ -7968,13 +7808,28 @@
         <w:rPr>
           <w:rFonts w:ascii="Arial" w:hAnsi="Arial" w:cs="Arial"/>
         </w:rPr>
-        <w:t xml:space="preserve"> </w:t>
-      </w:r>
-      <w:r>
-        <w:rPr>
-          <w:rFonts w:ascii="Arial" w:hAnsi="Arial" w:cs="Arial"/>
-        </w:rPr>
-        <w:t>The changes applied to the screen preview are kept while the tab is open, and the next "UPDATE" saves all of them. Leaving the tab or reloading the page discards the changes that were not saved.</w:t>
+        <w:t xml:space="preserve"> If the confirmation message is cancelled, the changes are not saved on the monitor.</w:t>
+      </w:r>
+    </w:p>
+    <w:p>
+      <w:pPr>
+        <w:rPr>
+          <w:rFonts w:ascii="Arial" w:hAnsi="Arial" w:cs="Arial"/>
+        </w:rPr>
+      </w:pPr>
+      <w:r>
+        <w:rPr>
+          <w:rFonts w:ascii="Arial" w:hAnsi="Arial" w:cs="Arial"/>
+          <w:b/>
+          <w:bCs/>
+        </w:rPr>
+        <w:t>Note:</w:t>
+      </w:r>
+      <w:r>
+        <w:rPr>
+          <w:rFonts w:ascii="Arial" w:hAnsi="Arial" w:cs="Arial"/>
+        </w:rPr>
+        <w:t xml:space="preserve"> The changes applied to the screen preview are kept while the tab is open, and the next "UPDATE" saves all of them. Leaving the tab or reloading the page discards the changes that were not saved.</w:t>
       </w:r>
     </w:p>
     <w:p>
@@ -8034,7 +7889,7 @@
               </w:rPr>
               <w:drawing>
                 <wp:inline distT="0" distB="0" distL="0" distR="0" wp14:anchorId="2F0939DB" wp14:editId="7FDFDE74">
-                  <wp:extent cx="5568286" cy="2608113"/>
+                  <wp:extent cx="5568286" cy="2578173"/>
                   <wp:effectExtent l="0" t="0" r="0" b="0"/>
                   <wp:docPr id="1534009537" name="Imagen 1"/>
                   <wp:cNvGraphicFramePr>
@@ -8056,7 +7911,7 @@
                         <pic:spPr>
                           <a:xfrm>
                             <a:off x="0" y="0"/>
-                            <a:ext cx="5568286" cy="2608113"/>
+                            <a:ext cx="5568286" cy="2578173"/>
                           </a:xfrm>
                           <a:prstGeom prst="rect">
                             <a:avLst/>
@@ -8094,6 +7949,142 @@
               <w:t>Edit current config screen, editing the “PROCESSING PAYMENT” text of the DLG_InicioCobroActual screen</w:t>
             </w:r>
           </w:p>
+          <w:p>
+            <w:pPr>
+              <w:keepNext/>
+              <w:jc w:val="center"/>
+              <w:rPr>
+                <w:rFonts w:ascii="Arial" w:hAnsi="Arial" w:cs="Arial"/>
+              </w:rPr>
+            </w:pPr>
+            <w:r>
+              <w:rPr>
+                <w:rFonts w:ascii="Arial" w:hAnsi="Arial" w:cs="Arial"/>
+                <w:noProof/>
+              </w:rPr>
+              <w:drawing>
+                <wp:inline distT="0" distB="0" distL="0" distR="0">
+                  <wp:extent cx="5568286" cy="2578173"/>
+                  <wp:effectExtent l="0" t="0" r="0" b="0"/>
+                  <wp:docPr id="990021" name="Imagen 21"/>
+                  <wp:cNvGraphicFramePr>
+                    <a:graphicFrameLocks xmlns:a="http://schemas.openxmlformats.org/drawingml/2006/main" noChangeAspect="1"/>
+                  </wp:cNvGraphicFramePr>
+                  <a:graphic xmlns:a="http://schemas.openxmlformats.org/drawingml/2006/main">
+                    <a:graphicData uri="http://schemas.openxmlformats.org/drawingml/2006/picture">
+                      <pic:pic xmlns:pic="http://schemas.openxmlformats.org/drawingml/2006/picture">
+                        <pic:nvPicPr>
+                          <pic:cNvPr id="990021" name=""/>
+                          <pic:cNvPicPr/>
+                        </pic:nvPicPr>
+                        <pic:blipFill>
+                          <a:blip r:embed="rId921"/>
+                          <a:stretch>
+                            <a:fillRect/>
+                          </a:stretch>
+                        </pic:blipFill>
+                        <pic:spPr>
+                          <a:xfrm>
+                            <a:off x="0" y="0"/>
+                            <a:ext cx="5568286" cy="2578173"/>
+                          </a:xfrm>
+                          <a:prstGeom prst="rect">
+                            <a:avLst/>
+                          </a:prstGeom>
+                        </pic:spPr>
+                      </pic:pic>
+                    </a:graphicData>
+                  </a:graphic>
+                </wp:inline>
+              </w:drawing>
+            </w:r>
+          </w:p>
+          <w:p>
+            <w:pPr>
+              <w:jc w:val="center"/>
+              <w:rPr>
+                <w:rFonts w:ascii="Arial" w:hAnsi="Arial" w:cs="Arial"/>
+                <w:b/>
+                <w:bCs/>
+              </w:rPr>
+            </w:pPr>
+            <w:r>
+              <w:rPr>
+                <w:rFonts w:ascii="Arial" w:hAnsi="Arial" w:cs="Arial"/>
+                <w:b/>
+                <w:bCs/>
+              </w:rPr>
+              <w:t>Properties tab (scrolled): style fields, DIT binding and APPLY CHANGES</w:t>
+            </w:r>
+          </w:p>
+          <w:p>
+            <w:pPr>
+              <w:keepNext/>
+              <w:jc w:val="center"/>
+              <w:rPr>
+                <w:rFonts w:ascii="Arial" w:hAnsi="Arial" w:cs="Arial"/>
+              </w:rPr>
+            </w:pPr>
+            <w:r>
+              <w:rPr>
+                <w:rFonts w:ascii="Arial" w:hAnsi="Arial" w:cs="Arial"/>
+                <w:noProof/>
+              </w:rPr>
+              <w:drawing>
+                <wp:inline distT="0" distB="0" distL="0" distR="0">
+                  <wp:extent cx="5568286" cy="2578173"/>
+                  <wp:effectExtent l="0" t="0" r="0" b="0"/>
+                  <wp:docPr id="990020" name="Imagen 20"/>
+                  <wp:cNvGraphicFramePr>
+                    <a:graphicFrameLocks xmlns:a="http://schemas.openxmlformats.org/drawingml/2006/main" noChangeAspect="1"/>
+                  </wp:cNvGraphicFramePr>
+                  <a:graphic xmlns:a="http://schemas.openxmlformats.org/drawingml/2006/main">
+                    <a:graphicData uri="http://schemas.openxmlformats.org/drawingml/2006/picture">
+                      <pic:pic xmlns:pic="http://schemas.openxmlformats.org/drawingml/2006/picture">
+                        <pic:nvPicPr>
+                          <pic:cNvPr id="990020" name=""/>
+                          <pic:cNvPicPr/>
+                        </pic:nvPicPr>
+                        <pic:blipFill>
+                          <a:blip r:embed="rId920"/>
+                          <a:stretch>
+                            <a:fillRect/>
+                          </a:stretch>
+                        </pic:blipFill>
+                        <pic:spPr>
+                          <a:xfrm>
+                            <a:off x="0" y="0"/>
+                            <a:ext cx="5568286" cy="2578173"/>
+                          </a:xfrm>
+                          <a:prstGeom prst="rect">
+                            <a:avLst/>
+                          </a:prstGeom>
+                        </pic:spPr>
+                      </pic:pic>
+                    </a:graphicData>
+                  </a:graphic>
+                </wp:inline>
+              </w:drawing>
+            </w:r>
+          </w:p>
+          <w:p>
+            <w:pPr>
+              <w:jc w:val="center"/>
+              <w:rPr>
+                <w:rFonts w:ascii="Arial" w:hAnsi="Arial" w:cs="Arial"/>
+                <w:b/>
+                <w:bCs/>
+              </w:rPr>
+            </w:pPr>
+            <w:r>
+              <w:rPr>
+                <w:rFonts w:ascii="Arial" w:hAnsi="Arial" w:cs="Arial"/>
+                <w:b/>
+                <w:bCs/>
+              </w:rPr>
+              <w:t>JSON tab: code of the selected element</w:t>
+            </w:r>
+          </w:p>
         </w:tc>
       </w:tr>
     </w:tbl>
@@ -8162,7 +8153,43 @@
         <w:rPr>
           <w:rFonts w:ascii="Arial" w:hAnsi="Arial" w:cs="Arial"/>
         </w:rPr>
+        <w:t xml:space="preserve">The indicator next to each IP shows whether the monitor is switched on and reachable on the network: green when it is, red when it is not. The checkbox of a monitor is enabled only when its indicator is green.</w:t>
+      </w:r>
+    </w:p>
+    <w:p>
+      <w:pPr>
+        <w:pStyle w:val="ListParagraph"/>
+        <w:numPr>
+          <w:ilvl w:val="0"/>
+          <w:numId w:val="5"/>
+        </w:numPr>
+        <w:rPr>
+          <w:rFonts w:ascii="Arial" w:hAnsi="Arial" w:cs="Arial"/>
+        </w:rPr>
+      </w:pPr>
+      <w:r>
+        <w:rPr>
+          <w:rFonts w:ascii="Arial" w:hAnsi="Arial" w:cs="Arial"/>
+        </w:rPr>
         <w:t>Allows selecting specific screens to share, with a preview.</w:t>
+      </w:r>
+    </w:p>
+    <w:p>
+      <w:pPr>
+        <w:pStyle w:val="ListParagraph"/>
+        <w:numPr>
+          <w:ilvl w:val="0"/>
+          <w:numId w:val="5"/>
+        </w:numPr>
+        <w:rPr>
+          <w:rFonts w:ascii="Arial" w:hAnsi="Arial" w:cs="Arial"/>
+        </w:rPr>
+      </w:pPr>
+      <w:r>
+        <w:rPr>
+          <w:rFonts w:ascii="Arial" w:hAnsi="Arial" w:cs="Arial"/>
+        </w:rPr>
+        <w:t xml:space="preserve">The configuration of the current device is shared with the monitors whose checkbox is ticked. Sharing the images is not covered yet (pending to be developed or confirmed).</w:t>
       </w:r>
     </w:p>
     <w:p>
@@ -8234,7 +8261,7 @@
               </w:rPr>
               <w:drawing>
                 <wp:inline distT="0" distB="0" distL="0" distR="0" wp14:anchorId="1A4DE303" wp14:editId="6CCF6F41">
-                  <wp:extent cx="5394960" cy="2518804"/>
+                  <wp:extent cx="5394960" cy="2497922"/>
                   <wp:effectExtent l="0" t="0" r="0" b="0"/>
                   <wp:docPr id="1645691994" name="Imagen 1"/>
                   <wp:cNvGraphicFramePr>
@@ -8256,7 +8283,7 @@
                         <pic:spPr>
                           <a:xfrm>
                             <a:off x="0" y="0"/>
-                            <a:ext cx="5394960" cy="2518804"/>
+                            <a:ext cx="5394960" cy="2497922"/>
                           </a:xfrm>
                           <a:prstGeom prst="rect">
                             <a:avLst/>
@@ -8450,7 +8477,7 @@
         <w:rPr>
           <w:rFonts w:ascii="Arial" w:hAnsi="Arial" w:cs="Arial"/>
         </w:rPr>
-        <w:t xml:space="preserve"> shows the images stored on the monitor. “UPLOAD FILES” adds one or more images, the “x” button deletes an image and the arrow button downloads it. The images must keep their original name to be recognised by the application (for example, background-image for the background). Press “</w:t>
+        <w:t xml:space="preserve"> shows the images stored on the monitor. “UPLOAD FILES” adds one or more images, the “x” button deletes an image and the arrow button downloads it. PNG format is recommended to keep the transparencies. Only the name background-image.jpg is mandatory (background of the screens); the other names are free, but the file name is what the image elements refer to when the configuration is edited, so the name must be kept. Press “</w:t>
       </w:r>
       <w:r>
         <w:rPr>
@@ -8503,6 +8530,26 @@
     </w:p>
     <w:p>
       <w:pPr>
+        <w:pStyle w:val="ListParagraph"/>
+        <w:numPr>
+          <w:ilvl w:val="0"/>
+          <w:numId w:val="5"/>
+        </w:numPr>
+        <w:rPr>
+          <w:rFonts w:ascii="Arial" w:hAnsi="Arial" w:cs="Arial"/>
+        </w:rPr>
+      </w:pPr>
+      <w:r>
+        <w:rPr>
+          <w:rFonts w:ascii="Arial" w:hAnsi="Arial" w:cs="Arial"/>
+          <w:b/>
+          <w:bCs/>
+        </w:rPr>
+        <w:t xml:space="preserve">The fonts are optional: if none is uploaded the lists are shown empty and the default font Rubik is used.</w:t>
+      </w:r>
+    </w:p>
+    <w:p>
+      <w:pPr>
         <w:rPr>
           <w:rFonts w:ascii="Arial" w:hAnsi="Arial" w:cs="Arial"/>
         </w:rPr>
@@ -8536,7 +8583,7 @@
               </w:rPr>
               <w:drawing>
                 <wp:inline distT="0" distB="0" distL="0" distR="0" wp14:anchorId="7B30B440" wp14:editId="16800220">
-                  <wp:extent cx="5600000" cy="2622967"/>
+                  <wp:extent cx="5600000" cy="3630000"/>
                   <wp:effectExtent l="0" t="0" r="0" b="0"/>
                   <wp:docPr id="900000101" name="resources"/>
                   <wp:cNvGraphicFramePr>
@@ -8558,7 +8605,7 @@
                         <pic:spPr>
                           <a:xfrm>
                             <a:off x="0" y="0"/>
-                            <a:ext cx="5600000" cy="2622967"/>
+                            <a:ext cx="5600000" cy="3630000"/>
                           </a:xfrm>
                           <a:prstGeom prst="rect">
                             <a:avLst/>
@@ -8664,7 +8711,7 @@
         <w:rPr>
           <w:rFonts w:ascii="Arial" w:hAnsi="Arial" w:cs="Arial"/>
         </w:rPr>
-        <w:t>The “Screen list” shows all the screens of the current configuration with their event code. Select the screen to test.</w:t>
+        <w:t>The “Screen list” shows all the screens of the current configuration with their event code (IDLE 5, READING_PLATE 9, PLEASE_PROCEED 12, DLG_PAYMENT_REQUIRED 36, DLG_InicioCobroActual 89, USER 8, DLG_CARD_ERROR 18, IDLE_DISCONNECTED 1005, DLG_BOOT 0, DLG_OUT_SERVICE 6 and DLG_BLOCKED 96). Tick the checkbox of the screen to test; only one screen can be selected at a time.</w:t>
       </w:r>
     </w:p>
     <w:p>
@@ -8682,7 +8729,7 @@
         <w:rPr>
           <w:rFonts w:ascii="Arial" w:hAnsi="Arial" w:cs="Arial"/>
         </w:rPr>
-        <w:t>If the screen uses data sent by the terminal (for example, the amount to pay, the card reader or the licence plate), a form is shown for each DIT with its fields. Fill in all the fields with the test values.</w:t>
+        <w:t>If the screen uses data sent by the terminal (for example, the amount to pay, the card reader or the licence plate), a form is shown for each DIT used by the elements of the screen (the elements whose DIT properties are not empty), with its fields. Fill in all the fields with the test values.</w:t>
       </w:r>
     </w:p>
     <w:p>
@@ -8778,7 +8825,7 @@
               </w:rPr>
               <w:drawing>
                 <wp:inline distT="0" distB="0" distL="0" distR="0" wp14:anchorId="47DE374D" wp14:editId="32FC6F39">
-                  <wp:extent cx="5600000" cy="2167741"/>
+                  <wp:extent cx="5600000" cy="2592857"/>
                   <wp:effectExtent l="0" t="0" r="0" b="0"/>
                   <wp:docPr id="900000102" name="testing"/>
                   <wp:cNvGraphicFramePr>
@@ -8800,7 +8847,7 @@
                         <pic:spPr>
                           <a:xfrm>
                             <a:off x="0" y="0"/>
-                            <a:ext cx="5600000" cy="2167741"/>
+                            <a:ext cx="5600000" cy="2592857"/>
                           </a:xfrm>
                           <a:prstGeom prst="rect">
                             <a:avLst/>
@@ -8960,6 +9007,1244 @@
       </w:r>
     </w:p>
     <w:p/>
+    <w:p>
+      <w:pPr>
+        <w:pStyle w:val="Heading4"/>
+        <w:numPr>
+          <w:ilvl w:val="1"/>
+          <w:numId w:val="4"/>
+        </w:numPr>
+      </w:pPr>
+      <w:r>
+        <w:t xml:space="preserve">Text element and translations</w:t>
+      </w:r>
+    </w:p>
+    <w:p>
+      <w:pPr>
+        <w:spacing w:before="120"/>
+        <w:rPr>
+          <w:rFonts w:ascii="Arial" w:hAnsi="Arial" w:cs="Arial"/>
+        </w:rPr>
+      </w:pPr>
+      <w:r>
+        <w:rPr>
+          <w:rFonts w:ascii="Arial" w:hAnsi="Arial" w:cs="Arial"/>
+        </w:rPr>
+        <w:t xml:space="preserve">The text element ("element-type": "text") shows a text on the screen. It is edited in the Properties tab (Content, Style, Translations and DIT binding sections) or in the JSON tab of the element editor. Its properties are:</w:t>
+      </w:r>
+    </w:p>
+    <w:p>
+      <w:pPr>
+        <w:pStyle w:val="ListParagraph"/>
+        <w:numPr>
+          <w:ilvl w:val="0"/>
+          <w:numId w:val="5"/>
+        </w:numPr>
+        <w:rPr>
+          <w:rFonts w:ascii="Arial" w:hAnsi="Arial" w:cs="Arial"/>
+        </w:rPr>
+      </w:pPr>
+      <w:r>
+        <w:rPr>
+          <w:rFonts w:ascii="Arial" w:hAnsi="Arial" w:cs="Arial"/>
+          <w:b/>
+          <w:bCs/>
+        </w:rPr>
+        <w:t xml:space="preserve">dashboardItemId: </w:t>
+      </w:r>
+      <w:r>
+        <w:rPr>
+          <w:rFonts w:ascii="Arial" w:hAnsi="Arial" w:cs="Arial"/>
+        </w:rPr>
+        <w:t xml:space="preserve">identifier of the element (Item ID). Some IDs are used by the application and must not be changed: license-plate-value shows the text with the style of a licence plate (a space is inserted between letters and digits) and amount-to-pay-value shows the amount received in cents as euros and cents (for example 500 is shown as 5.00).</w:t>
+      </w:r>
+    </w:p>
+    <w:p>
+      <w:pPr>
+        <w:pStyle w:val="ListParagraph"/>
+        <w:numPr>
+          <w:ilvl w:val="0"/>
+          <w:numId w:val="5"/>
+        </w:numPr>
+        <w:rPr>
+          <w:rFonts w:ascii="Arial" w:hAnsi="Arial" w:cs="Arial"/>
+        </w:rPr>
+      </w:pPr>
+      <w:r>
+        <w:rPr>
+          <w:rFonts w:ascii="Arial" w:hAnsi="Arial" w:cs="Arial"/>
+          <w:b/>
+          <w:bCs/>
+        </w:rPr>
+        <w:t xml:space="preserve">defaultText: </w:t>
+      </w:r>
+      <w:r>
+        <w:rPr>
+          <w:rFonts w:ascii="Arial" w:hAnsi="Arial" w:cs="Arial"/>
+        </w:rPr>
+        <w:t xml:space="preserve">text shown by default. It is also shown when the element has no translation for the language that is being displayed. A line break can be included to show the text in two lines (for example "PROCESSING\r\nPAYMENT").</w:t>
+      </w:r>
+    </w:p>
+    <w:p>
+      <w:pPr>
+        <w:pStyle w:val="ListParagraph"/>
+        <w:numPr>
+          <w:ilvl w:val="0"/>
+          <w:numId w:val="5"/>
+        </w:numPr>
+        <w:rPr>
+          <w:rFonts w:ascii="Arial" w:hAnsi="Arial" w:cs="Arial"/>
+        </w:rPr>
+      </w:pPr>
+      <w:r>
+        <w:rPr>
+          <w:rFonts w:ascii="Arial" w:hAnsi="Arial" w:cs="Arial"/>
+          <w:b/>
+          <w:bCs/>
+        </w:rPr>
+        <w:t xml:space="preserve">textSize: </w:t>
+      </w:r>
+      <w:r>
+        <w:rPr>
+          <w:rFonts w:ascii="Arial" w:hAnsi="Arial" w:cs="Arial"/>
+        </w:rPr>
+        <w:t xml:space="preserve">size of the text. The size shown on the monitor is also adjusted with the scale factor of the monitor (Text size scale in the Connection tab).</w:t>
+      </w:r>
+    </w:p>
+    <w:p>
+      <w:pPr>
+        <w:pStyle w:val="ListParagraph"/>
+        <w:numPr>
+          <w:ilvl w:val="0"/>
+          <w:numId w:val="5"/>
+        </w:numPr>
+        <w:rPr>
+          <w:rFonts w:ascii="Arial" w:hAnsi="Arial" w:cs="Arial"/>
+        </w:rPr>
+      </w:pPr>
+      <w:r>
+        <w:rPr>
+          <w:rFonts w:ascii="Arial" w:hAnsi="Arial" w:cs="Arial"/>
+          <w:b/>
+          <w:bCs/>
+        </w:rPr>
+        <w:t xml:space="preserve">textColor: </w:t>
+      </w:r>
+      <w:r>
+        <w:rPr>
+          <w:rFonts w:ascii="Arial" w:hAnsi="Arial" w:cs="Arial"/>
+        </w:rPr>
+        <w:t xml:space="preserve">colour of the text in hexadecimal format (for example #FFFFFF); the editor shows a colour sample.</w:t>
+      </w:r>
+    </w:p>
+    <w:p>
+      <w:pPr>
+        <w:pStyle w:val="ListParagraph"/>
+        <w:numPr>
+          <w:ilvl w:val="0"/>
+          <w:numId w:val="5"/>
+        </w:numPr>
+        <w:rPr>
+          <w:rFonts w:ascii="Arial" w:hAnsi="Arial" w:cs="Arial"/>
+        </w:rPr>
+      </w:pPr>
+      <w:r>
+        <w:rPr>
+          <w:rFonts w:ascii="Arial" w:hAnsi="Arial" w:cs="Arial"/>
+          <w:b/>
+          <w:bCs/>
+        </w:rPr>
+        <w:t xml:space="preserve">padding: </w:t>
+      </w:r>
+      <w:r>
+        <w:rPr>
+          <w:rFonts w:ascii="Arial" w:hAnsi="Arial" w:cs="Arial"/>
+        </w:rPr>
+        <w:t xml:space="preserve">space around the text.</w:t>
+      </w:r>
+    </w:p>
+    <w:p>
+      <w:pPr>
+        <w:pStyle w:val="ListParagraph"/>
+        <w:numPr>
+          <w:ilvl w:val="0"/>
+          <w:numId w:val="5"/>
+        </w:numPr>
+        <w:rPr>
+          <w:rFonts w:ascii="Arial" w:hAnsi="Arial" w:cs="Arial"/>
+        </w:rPr>
+      </w:pPr>
+      <w:r>
+        <w:rPr>
+          <w:rFonts w:ascii="Arial" w:hAnsi="Arial" w:cs="Arial"/>
+          <w:b/>
+          <w:bCs/>
+        </w:rPr>
+        <w:t xml:space="preserve">fontWeight: </w:t>
+      </w:r>
+      <w:r>
+        <w:rPr>
+          <w:rFonts w:ascii="Arial" w:hAnsi="Arial" w:cs="Arial"/>
+        </w:rPr>
+        <w:t xml:space="preserve">weight of the font: Bold, Medium or Regular. The font file uploaded in the Resources file tab for that weight is used; if there is none, the default font Rubik is used.</w:t>
+      </w:r>
+    </w:p>
+    <w:p>
+      <w:pPr>
+        <w:pStyle w:val="ListParagraph"/>
+        <w:numPr>
+          <w:ilvl w:val="0"/>
+          <w:numId w:val="5"/>
+        </w:numPr>
+        <w:rPr>
+          <w:rFonts w:ascii="Arial" w:hAnsi="Arial" w:cs="Arial"/>
+        </w:rPr>
+      </w:pPr>
+      <w:r>
+        <w:rPr>
+          <w:rFonts w:ascii="Arial" w:hAnsi="Arial" w:cs="Arial"/>
+          <w:b/>
+          <w:bCs/>
+        </w:rPr>
+        <w:t xml:space="preserve">dataKey, ditTypeCode and validValue: </w:t>
+      </w:r>
+      <w:r>
+        <w:rPr>
+          <w:rFonts w:ascii="Arial" w:hAnsi="Arial" w:cs="Arial"/>
+        </w:rPr>
+        <w:t xml:space="preserve">DIT binding (optional). The element is shown only when the terminal sends a DIT of the type ditTypeCode whose key dataKey has the value validValue (see Validations and code combinations). If dataKey is empty the element is always shown.</w:t>
+      </w:r>
+    </w:p>
+    <w:p>
+      <w:pPr>
+        <w:pStyle w:val="ListParagraph"/>
+        <w:numPr>
+          <w:ilvl w:val="0"/>
+          <w:numId w:val="5"/>
+        </w:numPr>
+        <w:rPr>
+          <w:rFonts w:ascii="Arial" w:hAnsi="Arial" w:cs="Arial"/>
+        </w:rPr>
+      </w:pPr>
+      <w:r>
+        <w:rPr>
+          <w:rFonts w:ascii="Arial" w:hAnsi="Arial" w:cs="Arial"/>
+          <w:b/>
+          <w:bCs/>
+        </w:rPr>
+        <w:t xml:space="preserve">translations: </w:t>
+      </w:r>
+      <w:r>
+        <w:rPr>
+          <w:rFonts w:ascii="Arial" w:hAnsi="Arial" w:cs="Arial"/>
+        </w:rPr>
+        <w:t xml:space="preserve">texts of the element in each language (see below).</w:t>
+      </w:r>
+    </w:p>
+    <w:p>
+      <w:pPr>
+        <w:spacing w:before="120"/>
+        <w:rPr>
+          <w:rFonts w:ascii="Arial" w:hAnsi="Arial" w:cs="Arial"/>
+        </w:rPr>
+      </w:pPr>
+      <w:r>
+        <w:rPr>
+          <w:rFonts w:ascii="Arial" w:hAnsi="Arial" w:cs="Arial"/>
+          <w:b/>
+          <w:bCs/>
+        </w:rPr>
+        <w:t xml:space="preserve">Translations</w:t>
+      </w:r>
+      <w:r>
+        <w:rPr>
+          <w:rFonts w:ascii="Arial" w:hAnsi="Arial" w:cs="Arial"/>
+        </w:rPr>
+        <w:t xml:space="preserve"/>
+      </w:r>
+    </w:p>
+    <w:p>
+      <w:pPr>
+        <w:spacing w:before="120"/>
+        <w:rPr>
+          <w:rFonts w:ascii="Arial" w:hAnsi="Arial" w:cs="Arial"/>
+        </w:rPr>
+      </w:pPr>
+      <w:r>
+        <w:rPr>
+          <w:rFonts w:ascii="Arial" w:hAnsi="Arial" w:cs="Arial"/>
+        </w:rPr>
+        <w:t xml:space="preserve">The translations property is a list of pairs "language key": "text". In the Translations section of the editor each row has a Lang field (the key), a Value field (the text) and a bin button to remove it; the button to add a translation creates a new row with the next key (lang1, lang2, ...) and the default text as value. Rows with an empty Lang are ignored when the changes are applied.</w:t>
+      </w:r>
+    </w:p>
+    <w:p>
+      <w:pPr>
+        <w:spacing w:before="120"/>
+        <w:rPr>
+          <w:rFonts w:ascii="Arial" w:hAnsi="Arial" w:cs="Arial"/>
+        </w:rPr>
+      </w:pPr>
+      <w:r>
+        <w:rPr>
+          <w:rFonts w:ascii="Arial" w:hAnsi="Arial" w:cs="Arial"/>
+        </w:rPr>
+        <w:t xml:space="preserve">Example of an element with two languages:</w:t>
+      </w:r>
+    </w:p>
+    <w:p>
+      <w:pPr>
+        <w:spacing w:before="0" w:after="0"/>
+        <w:ind w:left="567"/>
+      </w:pPr>
+      <w:r>
+        <w:rPr>
+          <w:rFonts w:ascii="Courier New" w:hAnsi="Courier New" w:cs="Courier New"/>
+          <w:sz w:val="16"/>
+        </w:rPr>
+        <w:t xml:space="preserve">"translations": {</w:t>
+      </w:r>
+    </w:p>
+    <w:p>
+      <w:pPr>
+        <w:spacing w:before="0" w:after="0"/>
+        <w:ind w:left="567"/>
+      </w:pPr>
+      <w:r>
+        <w:rPr>
+          <w:rFonts w:ascii="Courier New" w:hAnsi="Courier New" w:cs="Courier New"/>
+          <w:sz w:val="16"/>
+        </w:rPr>
+        <w:t xml:space="preserve">  "lang1": "GRÀCIES PER",</w:t>
+      </w:r>
+    </w:p>
+    <w:p>
+      <w:pPr>
+        <w:spacing w:before="0" w:after="0"/>
+        <w:ind w:left="567"/>
+      </w:pPr>
+      <w:r>
+        <w:rPr>
+          <w:rFonts w:ascii="Courier New" w:hAnsi="Courier New" w:cs="Courier New"/>
+          <w:sz w:val="16"/>
+        </w:rPr>
+        <w:t xml:space="preserve">  "lang2": "GRACIAS POR"</w:t>
+      </w:r>
+    </w:p>
+    <w:p>
+      <w:pPr>
+        <w:spacing w:before="0" w:after="0"/>
+        <w:ind w:left="567"/>
+      </w:pPr>
+      <w:r>
+        <w:rPr>
+          <w:rFonts w:ascii="Courier New" w:hAnsi="Courier New" w:cs="Courier New"/>
+          <w:sz w:val="16"/>
+        </w:rPr>
+        <w:t xml:space="preserve">}</w:t>
+      </w:r>
+    </w:p>
+    <w:p>
+      <w:pPr>
+        <w:spacing w:before="120"/>
+        <w:rPr>
+          <w:rFonts w:ascii="Arial" w:hAnsi="Arial" w:cs="Arial"/>
+        </w:rPr>
+      </w:pPr>
+      <w:r>
+        <w:rPr>
+          <w:rFonts w:ascii="Arial" w:hAnsi="Arial" w:cs="Arial"/>
+          <w:b/>
+          <w:bCs/>
+        </w:rPr>
+        <w:t xml:space="preserve">How the languages are rotated:</w:t>
+      </w:r>
+      <w:r>
+        <w:rPr>
+          <w:rFonts w:ascii="Arial" w:hAnsi="Arial" w:cs="Arial"/>
+        </w:rPr>
+        <w:t xml:space="preserve"/>
+      </w:r>
+    </w:p>
+    <w:p>
+      <w:pPr>
+        <w:pStyle w:val="ListParagraph"/>
+        <w:numPr>
+          <w:ilvl w:val="0"/>
+          <w:numId w:val="5"/>
+        </w:numPr>
+        <w:rPr>
+          <w:rFonts w:ascii="Arial" w:hAnsi="Arial" w:cs="Arial"/>
+        </w:rPr>
+      </w:pPr>
+      <w:r>
+        <w:rPr>
+          <w:rFonts w:ascii="Arial" w:hAnsi="Arial" w:cs="Arial"/>
+          <w:b/>
+          <w:bCs/>
+        </w:rPr>
+        <w:t xml:space="preserve">Delay time(s): </w:t>
+      </w:r>
+      <w:r>
+        <w:rPr>
+          <w:rFonts w:ascii="Arial" w:hAnsi="Arial" w:cs="Arial"/>
+        </w:rPr>
+        <w:t xml:space="preserve">the Delay time(s) field of the Connection tab sets the number of seconds that each language stays on screen. If a screen has two or three languages, the texts change from one language to the next every Delay time(s) seconds, and when the last language is reached it starts again from the first one. If the screen has no translations, the texts do not change.</w:t>
+      </w:r>
+    </w:p>
+    <w:p>
+      <w:pPr>
+        <w:pStyle w:val="ListParagraph"/>
+        <w:numPr>
+          <w:ilvl w:val="0"/>
+          <w:numId w:val="5"/>
+        </w:numPr>
+        <w:rPr>
+          <w:rFonts w:ascii="Arial" w:hAnsi="Arial" w:cs="Arial"/>
+        </w:rPr>
+      </w:pPr>
+      <w:r>
+        <w:rPr>
+          <w:rFonts w:ascii="Arial" w:hAnsi="Arial" w:cs="Arial"/>
+          <w:b/>
+          <w:bCs/>
+        </w:rPr>
+        <w:t xml:space="preserve">Keys must match: </w:t>
+      </w:r>
+      <w:r>
+        <w:rPr>
+          <w:rFonts w:ascii="Arial" w:hAnsi="Arial" w:cs="Arial"/>
+        </w:rPr>
+        <w:t xml:space="preserve">the monitor builds the list of languages of a screen with all the keys found in the translations of all its text elements, so the keys must be the same in all the text elements of the screen. If one element uses the keys lang1 and lang2, all the other text elements with two languages must also use lang1 and lang2 (and lang1, lang2 and lang3 for three languages). The first key found (normally lang1) is the first language shown.</w:t>
+      </w:r>
+    </w:p>
+    <w:p>
+      <w:pPr>
+        <w:pStyle w:val="ListParagraph"/>
+        <w:numPr>
+          <w:ilvl w:val="0"/>
+          <w:numId w:val="5"/>
+        </w:numPr>
+        <w:rPr>
+          <w:rFonts w:ascii="Arial" w:hAnsi="Arial" w:cs="Arial"/>
+        </w:rPr>
+      </w:pPr>
+      <w:r>
+        <w:rPr>
+          <w:rFonts w:ascii="Arial" w:hAnsi="Arial" w:cs="Arial"/>
+          <w:b/>
+          <w:bCs/>
+        </w:rPr>
+        <w:t xml:space="preserve">Different keys: </w:t>
+      </w:r>
+      <w:r>
+        <w:rPr>
+          <w:rFonts w:ascii="Arial" w:hAnsi="Arial" w:cs="Arial"/>
+        </w:rPr>
+        <w:t xml:space="preserve">a key that does not exist in the other elements (for example "es" instead of "lang2") is counted as an additional language, so the screen goes through one more step in the rotation, in which the elements that do not have that key show their defaultText.</w:t>
+      </w:r>
+    </w:p>
+    <w:p>
+      <w:pPr>
+        <w:pStyle w:val="ListParagraph"/>
+        <w:numPr>
+          <w:ilvl w:val="0"/>
+          <w:numId w:val="5"/>
+        </w:numPr>
+        <w:rPr>
+          <w:rFonts w:ascii="Arial" w:hAnsi="Arial" w:cs="Arial"/>
+        </w:rPr>
+      </w:pPr>
+      <w:r>
+        <w:rPr>
+          <w:rFonts w:ascii="Arial" w:hAnsi="Arial" w:cs="Arial"/>
+          <w:b/>
+          <w:bCs/>
+        </w:rPr>
+        <w:t xml:space="preserve">Texts without translation: </w:t>
+      </w:r>
+      <w:r>
+        <w:rPr>
+          <w:rFonts w:ascii="Arial" w:hAnsi="Arial" w:cs="Arial"/>
+        </w:rPr>
+        <w:t xml:space="preserve">a text element that has no translation for the language that is being displayed (or that has no translations at all) keeps showing its defaultText, so it does not change while the others rotate.</w:t>
+      </w:r>
+    </w:p>
+    <w:p>
+      <w:pPr>
+        <w:pStyle w:val="ListParagraph"/>
+        <w:numPr>
+          <w:ilvl w:val="0"/>
+          <w:numId w:val="5"/>
+        </w:numPr>
+        <w:rPr>
+          <w:rFonts w:ascii="Arial" w:hAnsi="Arial" w:cs="Arial"/>
+        </w:rPr>
+      </w:pPr>
+      <w:r>
+        <w:rPr>
+          <w:rFonts w:ascii="Arial" w:hAnsi="Arial" w:cs="Arial"/>
+          <w:b/>
+          <w:bCs/>
+        </w:rPr>
+        <w:t xml:space="preserve">Dynamic texts: </w:t>
+      </w:r>
+      <w:r>
+        <w:rPr>
+          <w:rFonts w:ascii="Arial" w:hAnsi="Arial" w:cs="Arial"/>
+        </w:rPr>
+        <w:t xml:space="preserve">a text element whose dataKey is filled in (for example the licence plate) shows the value sent by the terminal, unless it has translations and its validValue matches; in that case it shows the translation of the current language.</w:t>
+      </w:r>
+    </w:p>
+    <w:p>
+      <w:pPr>
+        <w:spacing w:before="120"/>
+        <w:rPr>
+          <w:rFonts w:ascii="Arial" w:hAnsi="Arial" w:cs="Arial"/>
+        </w:rPr>
+      </w:pPr>
+      <w:r>
+        <w:rPr>
+          <w:rFonts w:ascii="Arial" w:hAnsi="Arial" w:cs="Arial"/>
+        </w:rPr>
+        <w:t xml:space="preserve">Example of two text elements of the same screen that rotate between Catalan (lang1) and Spanish (lang2); both use the same keys:</w:t>
+      </w:r>
+    </w:p>
+    <w:p>
+      <w:pPr>
+        <w:spacing w:before="0" w:after="0"/>
+        <w:ind w:left="567"/>
+      </w:pPr>
+      <w:r>
+        <w:rPr>
+          <w:rFonts w:ascii="Courier New" w:hAnsi="Courier New" w:cs="Courier New"/>
+          <w:sz w:val="16"/>
+        </w:rPr>
+        <w:t xml:space="preserve">{ "element-type": "text", "data": {</w:t>
+      </w:r>
+    </w:p>
+    <w:p>
+      <w:pPr>
+        <w:spacing w:before="0" w:after="0"/>
+        <w:ind w:left="567"/>
+      </w:pPr>
+      <w:r>
+        <w:rPr>
+          <w:rFonts w:ascii="Courier New" w:hAnsi="Courier New" w:cs="Courier New"/>
+          <w:sz w:val="16"/>
+        </w:rPr>
+        <w:t xml:space="preserve">    "dashboardItemId": "label1", "defaultText": "GRÀCIES PER",</w:t>
+      </w:r>
+    </w:p>
+    <w:p>
+      <w:pPr>
+        <w:spacing w:before="0" w:after="0"/>
+        <w:ind w:left="567"/>
+      </w:pPr>
+      <w:r>
+        <w:rPr>
+          <w:rFonts w:ascii="Courier New" w:hAnsi="Courier New" w:cs="Courier New"/>
+          <w:sz w:val="16"/>
+        </w:rPr>
+        <w:t xml:space="preserve">    "textSize": 36, "textColor": "#FFFFFF", "padding": 0, "fontWeight": "Medium",</w:t>
+      </w:r>
+    </w:p>
+    <w:p>
+      <w:pPr>
+        <w:spacing w:before="0" w:after="0"/>
+        <w:ind w:left="567"/>
+      </w:pPr>
+      <w:r>
+        <w:rPr>
+          <w:rFonts w:ascii="Courier New" w:hAnsi="Courier New" w:cs="Courier New"/>
+          <w:sz w:val="16"/>
+        </w:rPr>
+        <w:t xml:space="preserve">    "translations": { "lang1": "GRÀCIES PER", "lang2": "GRACIAS POR" } } }</w:t>
+      </w:r>
+    </w:p>
+    <w:p>
+      <w:pPr>
+        <w:spacing w:before="0" w:after="0"/>
+        <w:ind w:left="567"/>
+      </w:pPr>
+      <w:r>
+        <w:rPr>
+          <w:rFonts w:ascii="Courier New" w:hAnsi="Courier New" w:cs="Courier New"/>
+          <w:sz w:val="16"/>
+        </w:rPr>
+        <w:t xml:space="preserve">{ "element-type": "text", "data": {</w:t>
+      </w:r>
+    </w:p>
+    <w:p>
+      <w:pPr>
+        <w:spacing w:before="0" w:after="0"/>
+        <w:ind w:left="567"/>
+      </w:pPr>
+      <w:r>
+        <w:rPr>
+          <w:rFonts w:ascii="Courier New" w:hAnsi="Courier New" w:cs="Courier New"/>
+          <w:sz w:val="16"/>
+        </w:rPr>
+        <w:t xml:space="preserve">    "dashboardItemId": "label2", "defaultText": "LA SEVA VISITA",</w:t>
+      </w:r>
+    </w:p>
+    <w:p>
+      <w:pPr>
+        <w:spacing w:before="0" w:after="0"/>
+        <w:ind w:left="567"/>
+      </w:pPr>
+      <w:r>
+        <w:rPr>
+          <w:rFonts w:ascii="Courier New" w:hAnsi="Courier New" w:cs="Courier New"/>
+          <w:sz w:val="16"/>
+        </w:rPr>
+        <w:t xml:space="preserve">    "textSize": 36, "textColor": "#FFFFFF", "padding": 0, "fontWeight": "Medium",</w:t>
+      </w:r>
+    </w:p>
+    <w:p>
+      <w:pPr>
+        <w:spacing w:before="0" w:after="0"/>
+        <w:ind w:left="567"/>
+      </w:pPr>
+      <w:r>
+        <w:rPr>
+          <w:rFonts w:ascii="Courier New" w:hAnsi="Courier New" w:cs="Courier New"/>
+          <w:sz w:val="16"/>
+        </w:rPr>
+        <w:t xml:space="preserve">    "translations": { "lang1": "LA SEVA VISITA", "lang2": "SU VISITA" } } }</w:t>
+      </w:r>
+    </w:p>
+    <w:p>
+      <w:pPr>
+        <w:spacing w:before="120"/>
+        <w:rPr>
+          <w:rFonts w:ascii="Arial" w:hAnsi="Arial" w:cs="Arial"/>
+        </w:rPr>
+      </w:pPr>
+      <w:r>
+        <w:rPr>
+          <w:rFonts w:ascii="Arial" w:hAnsi="Arial" w:cs="Arial"/>
+          <w:b/>
+          <w:bCs/>
+        </w:rPr>
+        <w:t xml:space="preserve">Editing a text element step by step</w:t>
+      </w:r>
+    </w:p>
+    <w:p>
+      <w:pPr>
+        <w:spacing w:before="120"/>
+        <w:rPr>
+          <w:rFonts w:ascii="Arial" w:hAnsi="Arial" w:cs="Arial"/>
+        </w:rPr>
+      </w:pPr>
+      <w:r>
+        <w:rPr>
+          <w:rFonts w:ascii="Arial" w:hAnsi="Arial" w:cs="Arial"/>
+          <w:b/>
+          <w:bCs/>
+        </w:rPr>
+        <w:t xml:space="preserve">Step 1. </w:t>
+      </w:r>
+      <w:r>
+        <w:rPr>
+          <w:rFonts w:ascii="Arial" w:hAnsi="Arial" w:cs="Arial"/>
+        </w:rPr>
+        <w:t xml:space="preserve">In the Edit current config tab, select the screen that contains the text in the Screen list (for example IDLE). The screen is loaded in the Screen preview.</w:t>
+      </w:r>
+    </w:p>
+    <w:p>
+      <w:pPr>
+        <w:keepNext/>
+        <w:spacing w:before="120" w:after="0"/>
+        <w:jc w:val="center"/>
+      </w:pPr>
+      <w:r>
+        <w:rPr>
+          <w:noProof/>
+        </w:rPr>
+        <w:drawing>
+          <wp:inline distT="0" distB="0" distL="0" distR="0">
+            <wp:extent cx="5600000" cy="2592857"/>
+            <wp:effectExtent l="0" t="0" r="0" b="0"/>
+            <wp:docPr id="990060" name="Imagen 990060"/>
+            <wp:cNvGraphicFramePr>
+              <a:graphicFrameLocks xmlns:a="http://schemas.openxmlformats.org/drawingml/2006/main" noChangeAspect="1"/>
+            </wp:cNvGraphicFramePr>
+            <a:graphic xmlns:a="http://schemas.openxmlformats.org/drawingml/2006/main">
+              <a:graphicData uri="http://schemas.openxmlformats.org/drawingml/2006/picture">
+                <pic:pic xmlns:pic="http://schemas.openxmlformats.org/drawingml/2006/picture">
+                  <pic:nvPicPr>
+                    <pic:cNvPr id="990060" name=""/>
+                    <pic:cNvPicPr/>
+                  </pic:nvPicPr>
+                  <pic:blipFill>
+                    <a:blip r:embed="rId930"/>
+                    <a:stretch>
+                      <a:fillRect/>
+                    </a:stretch>
+                  </pic:blipFill>
+                  <pic:spPr>
+                    <a:xfrm>
+                      <a:off x="0" y="0"/>
+                      <a:ext cx="5600000" cy="2592857"/>
+                    </a:xfrm>
+                    <a:prstGeom prst="rect">
+                      <a:avLst/>
+                    </a:prstGeom>
+                  </pic:spPr>
+                </pic:pic>
+              </a:graphicData>
+            </a:graphic>
+          </wp:inline>
+        </w:drawing>
+      </w:r>
+    </w:p>
+    <w:p>
+      <w:pPr>
+        <w:spacing w:before="40" w:after="120"/>
+        <w:jc w:val="center"/>
+        <w:rPr>
+          <w:rFonts w:ascii="Arial" w:hAnsi="Arial" w:cs="Arial"/>
+          <w:b/>
+          <w:bCs/>
+        </w:rPr>
+      </w:pPr>
+      <w:r>
+        <w:rPr>
+          <w:rFonts w:ascii="Arial" w:hAnsi="Arial" w:cs="Arial"/>
+          <w:b/>
+          <w:bCs/>
+        </w:rPr>
+        <w:t xml:space="preserve">Step 1: select the screen in the Screen list; its preview is shown in the centre</w:t>
+      </w:r>
+    </w:p>
+    <w:p>
+      <w:pPr>
+        <w:spacing w:before="120"/>
+        <w:rPr>
+          <w:rFonts w:ascii="Arial" w:hAnsi="Arial" w:cs="Arial"/>
+        </w:rPr>
+      </w:pPr>
+      <w:r>
+        <w:rPr>
+          <w:rFonts w:ascii="Arial" w:hAnsi="Arial" w:cs="Arial"/>
+          <w:b/>
+          <w:bCs/>
+        </w:rPr>
+        <w:t xml:space="preserve">Step 2. </w:t>
+      </w:r>
+      <w:r>
+        <w:rPr>
+          <w:rFonts w:ascii="Arial" w:hAnsi="Arial" w:cs="Arial"/>
+        </w:rPr>
+        <w:t xml:space="preserve">Click the element in the preview (for example the white box with the texts). The Element editor shows its Structure: a tree with the element and all the elements it contains (spacers, texts, images, etc.).</w:t>
+      </w:r>
+    </w:p>
+    <w:p>
+      <w:pPr>
+        <w:keepNext/>
+        <w:spacing w:before="120" w:after="0"/>
+        <w:jc w:val="center"/>
+      </w:pPr>
+      <w:r>
+        <w:rPr>
+          <w:noProof/>
+        </w:rPr>
+        <w:drawing>
+          <wp:inline distT="0" distB="0" distL="0" distR="0">
+            <wp:extent cx="5000000" cy="3225191"/>
+            <wp:effectExtent l="0" t="0" r="0" b="0"/>
+            <wp:docPr id="990061" name="Imagen 990061"/>
+            <wp:cNvGraphicFramePr>
+              <a:graphicFrameLocks xmlns:a="http://schemas.openxmlformats.org/drawingml/2006/main" noChangeAspect="1"/>
+            </wp:cNvGraphicFramePr>
+            <a:graphic xmlns:a="http://schemas.openxmlformats.org/drawingml/2006/main">
+              <a:graphicData uri="http://schemas.openxmlformats.org/drawingml/2006/picture">
+                <pic:pic xmlns:pic="http://schemas.openxmlformats.org/drawingml/2006/picture">
+                  <pic:nvPicPr>
+                    <pic:cNvPr id="990061" name=""/>
+                    <pic:cNvPicPr/>
+                  </pic:nvPicPr>
+                  <pic:blipFill>
+                    <a:blip r:embed="rId931"/>
+                    <a:stretch>
+                      <a:fillRect/>
+                    </a:stretch>
+                  </pic:blipFill>
+                  <pic:spPr>
+                    <a:xfrm>
+                      <a:off x="0" y="0"/>
+                      <a:ext cx="5000000" cy="3225191"/>
+                    </a:xfrm>
+                    <a:prstGeom prst="rect">
+                      <a:avLst/>
+                    </a:prstGeom>
+                  </pic:spPr>
+                </pic:pic>
+              </a:graphicData>
+            </a:graphic>
+          </wp:inline>
+        </w:drawing>
+      </w:r>
+    </w:p>
+    <w:p>
+      <w:pPr>
+        <w:spacing w:before="40" w:after="120"/>
+        <w:jc w:val="center"/>
+        <w:rPr>
+          <w:rFonts w:ascii="Arial" w:hAnsi="Arial" w:cs="Arial"/>
+          <w:b/>
+          <w:bCs/>
+        </w:rPr>
+      </w:pPr>
+      <w:r>
+        <w:rPr>
+          <w:rFonts w:ascii="Arial" w:hAnsi="Arial" w:cs="Arial"/>
+          <w:b/>
+          <w:bCs/>
+        </w:rPr>
+        <w:t xml:space="preserve">Step 2: select an element in the preview; the Structure tree shows the selected element and its content</w:t>
+      </w:r>
+    </w:p>
+    <w:p>
+      <w:pPr>
+        <w:spacing w:before="120"/>
+        <w:rPr>
+          <w:rFonts w:ascii="Arial" w:hAnsi="Arial" w:cs="Arial"/>
+        </w:rPr>
+      </w:pPr>
+      <w:r>
+        <w:rPr>
+          <w:rFonts w:ascii="Arial" w:hAnsi="Arial" w:cs="Arial"/>
+          <w:b/>
+          <w:bCs/>
+        </w:rPr>
+        <w:t xml:space="preserve">Step 3. </w:t>
+      </w:r>
+      <w:r>
+        <w:rPr>
+          <w:rFonts w:ascii="Arial" w:hAnsi="Arial" w:cs="Arial"/>
+        </w:rPr>
+        <w:t xml:space="preserve">Click the text node of the tree (text "GRÀCIES PER"). The Properties tab shows its Content (Item ID and Default text) and Style (Text color, Text size, Padding and Font Weight) fields. A wrong value is marked in red.</w:t>
+      </w:r>
+    </w:p>
+    <w:p>
+      <w:pPr>
+        <w:keepNext/>
+        <w:spacing w:before="120" w:after="0"/>
+        <w:jc w:val="center"/>
+      </w:pPr>
+      <w:r>
+        <w:rPr>
+          <w:noProof/>
+        </w:rPr>
+        <w:drawing>
+          <wp:inline distT="0" distB="0" distL="0" distR="0">
+            <wp:extent cx="5000000" cy="3225191"/>
+            <wp:effectExtent l="0" t="0" r="0" b="0"/>
+            <wp:docPr id="990062" name="Imagen 990062"/>
+            <wp:cNvGraphicFramePr>
+              <a:graphicFrameLocks xmlns:a="http://schemas.openxmlformats.org/drawingml/2006/main" noChangeAspect="1"/>
+            </wp:cNvGraphicFramePr>
+            <a:graphic xmlns:a="http://schemas.openxmlformats.org/drawingml/2006/main">
+              <a:graphicData uri="http://schemas.openxmlformats.org/drawingml/2006/picture">
+                <pic:pic xmlns:pic="http://schemas.openxmlformats.org/drawingml/2006/picture">
+                  <pic:nvPicPr>
+                    <pic:cNvPr id="990062" name=""/>
+                    <pic:cNvPicPr/>
+                  </pic:nvPicPr>
+                  <pic:blipFill>
+                    <a:blip r:embed="rId932"/>
+                    <a:stretch>
+                      <a:fillRect/>
+                    </a:stretch>
+                  </pic:blipFill>
+                  <pic:spPr>
+                    <a:xfrm>
+                      <a:off x="0" y="0"/>
+                      <a:ext cx="5000000" cy="3225191"/>
+                    </a:xfrm>
+                    <a:prstGeom prst="rect">
+                      <a:avLst/>
+                    </a:prstGeom>
+                  </pic:spPr>
+                </pic:pic>
+              </a:graphicData>
+            </a:graphic>
+          </wp:inline>
+        </w:drawing>
+      </w:r>
+    </w:p>
+    <w:p>
+      <w:pPr>
+        <w:spacing w:before="40" w:after="120"/>
+        <w:jc w:val="center"/>
+        <w:rPr>
+          <w:rFonts w:ascii="Arial" w:hAnsi="Arial" w:cs="Arial"/>
+          <w:b/>
+          <w:bCs/>
+        </w:rPr>
+      </w:pPr>
+      <w:r>
+        <w:rPr>
+          <w:rFonts w:ascii="Arial" w:hAnsi="Arial" w:cs="Arial"/>
+          <w:b/>
+          <w:bCs/>
+        </w:rPr>
+        <w:t xml:space="preserve">Step 3: select the text node in the Structure tree; the Content and Style sections show its properties</w:t>
+      </w:r>
+    </w:p>
+    <w:p>
+      <w:pPr>
+        <w:spacing w:before="120"/>
+        <w:rPr>
+          <w:rFonts w:ascii="Arial" w:hAnsi="Arial" w:cs="Arial"/>
+        </w:rPr>
+      </w:pPr>
+      <w:r>
+        <w:rPr>
+          <w:rFonts w:ascii="Arial" w:hAnsi="Arial" w:cs="Arial"/>
+          <w:b/>
+          <w:bCs/>
+        </w:rPr>
+        <w:t xml:space="preserve">Step 4. </w:t>
+      </w:r>
+      <w:r>
+        <w:rPr>
+          <w:rFonts w:ascii="Arial" w:hAnsi="Arial" w:cs="Arial"/>
+        </w:rPr>
+        <w:t xml:space="preserve">Scroll down the editor to see the Translations section (one Lang/Value row for each language; ADD TRANSLATION adds a row and the bin button removes it) and the DIT binding section (Data key, DIT type code and Valid value). Remember that the Lang keys must be the same in all the text elements of the screen.</w:t>
+      </w:r>
+    </w:p>
+    <w:p>
+      <w:pPr>
+        <w:keepNext/>
+        <w:spacing w:before="120" w:after="0"/>
+        <w:jc w:val="center"/>
+      </w:pPr>
+      <w:r>
+        <w:rPr>
+          <w:noProof/>
+        </w:rPr>
+        <w:drawing>
+          <wp:inline distT="0" distB="0" distL="0" distR="0">
+            <wp:extent cx="5000000" cy="3225191"/>
+            <wp:effectExtent l="0" t="0" r="0" b="0"/>
+            <wp:docPr id="990063" name="Imagen 990063"/>
+            <wp:cNvGraphicFramePr>
+              <a:graphicFrameLocks xmlns:a="http://schemas.openxmlformats.org/drawingml/2006/main" noChangeAspect="1"/>
+            </wp:cNvGraphicFramePr>
+            <a:graphic xmlns:a="http://schemas.openxmlformats.org/drawingml/2006/main">
+              <a:graphicData uri="http://schemas.openxmlformats.org/drawingml/2006/picture">
+                <pic:pic xmlns:pic="http://schemas.openxmlformats.org/drawingml/2006/picture">
+                  <pic:nvPicPr>
+                    <pic:cNvPr id="990063" name=""/>
+                    <pic:cNvPicPr/>
+                  </pic:nvPicPr>
+                  <pic:blipFill>
+                    <a:blip r:embed="rId933"/>
+                    <a:stretch>
+                      <a:fillRect/>
+                    </a:stretch>
+                  </pic:blipFill>
+                  <pic:spPr>
+                    <a:xfrm>
+                      <a:off x="0" y="0"/>
+                      <a:ext cx="5000000" cy="3225191"/>
+                    </a:xfrm>
+                    <a:prstGeom prst="rect">
+                      <a:avLst/>
+                    </a:prstGeom>
+                  </pic:spPr>
+                </pic:pic>
+              </a:graphicData>
+            </a:graphic>
+          </wp:inline>
+        </w:drawing>
+      </w:r>
+    </w:p>
+    <w:p>
+      <w:pPr>
+        <w:spacing w:before="40" w:after="120"/>
+        <w:jc w:val="center"/>
+        <w:rPr>
+          <w:rFonts w:ascii="Arial" w:hAnsi="Arial" w:cs="Arial"/>
+          <w:b/>
+          <w:bCs/>
+        </w:rPr>
+      </w:pPr>
+      <w:r>
+        <w:rPr>
+          <w:rFonts w:ascii="Arial" w:hAnsi="Arial" w:cs="Arial"/>
+          <w:b/>
+          <w:bCs/>
+        </w:rPr>
+        <w:t xml:space="preserve">Step 4: Translations and DIT binding sections of the text element (scroll down the editor)</w:t>
+      </w:r>
+    </w:p>
+    <w:p>
+      <w:pPr>
+        <w:spacing w:before="120"/>
+        <w:rPr>
+          <w:rFonts w:ascii="Arial" w:hAnsi="Arial" w:cs="Arial"/>
+        </w:rPr>
+      </w:pPr>
+      <w:r>
+        <w:rPr>
+          <w:rFonts w:ascii="Arial" w:hAnsi="Arial" w:cs="Arial"/>
+          <w:b/>
+          <w:bCs/>
+        </w:rPr>
+        <w:t xml:space="preserve">Alternative. </w:t>
+      </w:r>
+      <w:r>
+        <w:rPr>
+          <w:rFonts w:ascii="Arial" w:hAnsi="Arial" w:cs="Arial"/>
+        </w:rPr>
+        <w:t xml:space="preserve">The JSON tab shows the code of the selected element, which can be edited directly or replaced by a complete element.</w:t>
+      </w:r>
+    </w:p>
+    <w:p>
+      <w:pPr>
+        <w:keepNext/>
+        <w:spacing w:before="120" w:after="0"/>
+        <w:jc w:val="center"/>
+      </w:pPr>
+      <w:r>
+        <w:rPr>
+          <w:noProof/>
+        </w:rPr>
+        <w:drawing>
+          <wp:inline distT="0" distB="0" distL="0" distR="0">
+            <wp:extent cx="5000000" cy="3225191"/>
+            <wp:effectExtent l="0" t="0" r="0" b="0"/>
+            <wp:docPr id="990064" name="Imagen 990064"/>
+            <wp:cNvGraphicFramePr>
+              <a:graphicFrameLocks xmlns:a="http://schemas.openxmlformats.org/drawingml/2006/main" noChangeAspect="1"/>
+            </wp:cNvGraphicFramePr>
+            <a:graphic xmlns:a="http://schemas.openxmlformats.org/drawingml/2006/main">
+              <a:graphicData uri="http://schemas.openxmlformats.org/drawingml/2006/picture">
+                <pic:pic xmlns:pic="http://schemas.openxmlformats.org/drawingml/2006/picture">
+                  <pic:nvPicPr>
+                    <pic:cNvPr id="990064" name=""/>
+                    <pic:cNvPicPr/>
+                  </pic:nvPicPr>
+                  <pic:blipFill>
+                    <a:blip r:embed="rId934"/>
+                    <a:stretch>
+                      <a:fillRect/>
+                    </a:stretch>
+                  </pic:blipFill>
+                  <pic:spPr>
+                    <a:xfrm>
+                      <a:off x="0" y="0"/>
+                      <a:ext cx="5000000" cy="3225191"/>
+                    </a:xfrm>
+                    <a:prstGeom prst="rect">
+                      <a:avLst/>
+                    </a:prstGeom>
+                  </pic:spPr>
+                </pic:pic>
+              </a:graphicData>
+            </a:graphic>
+          </wp:inline>
+        </w:drawing>
+      </w:r>
+    </w:p>
+    <w:p>
+      <w:pPr>
+        <w:spacing w:before="40" w:after="120"/>
+        <w:jc w:val="center"/>
+        <w:rPr>
+          <w:rFonts w:ascii="Arial" w:hAnsi="Arial" w:cs="Arial"/>
+          <w:b/>
+          <w:bCs/>
+        </w:rPr>
+      </w:pPr>
+      <w:r>
+        <w:rPr>
+          <w:rFonts w:ascii="Arial" w:hAnsi="Arial" w:cs="Arial"/>
+          <w:b/>
+          <w:bCs/>
+        </w:rPr>
+        <w:t xml:space="preserve">JSON tab: the same element as code, to edit it directly</w:t>
+      </w:r>
+    </w:p>
+    <w:p>
+      <w:pPr>
+        <w:spacing w:before="120"/>
+        <w:rPr>
+          <w:rFonts w:ascii="Arial" w:hAnsi="Arial" w:cs="Arial"/>
+        </w:rPr>
+      </w:pPr>
+      <w:r>
+        <w:rPr>
+          <w:rFonts w:ascii="Arial" w:hAnsi="Arial" w:cs="Arial"/>
+          <w:b/>
+          <w:bCs/>
+        </w:rPr>
+        <w:t xml:space="preserve">Step 5. </w:t>
+      </w:r>
+      <w:r>
+        <w:rPr>
+          <w:rFonts w:ascii="Arial" w:hAnsi="Arial" w:cs="Arial"/>
+        </w:rPr>
+        <w:t xml:space="preserve">Change the fields and press APPLY CHANGES. The element is updated in the Screen preview (here the Text size was changed from 34 to 44), but nothing is saved on the monitor yet.</w:t>
+      </w:r>
+    </w:p>
+    <w:p>
+      <w:pPr>
+        <w:keepNext/>
+        <w:spacing w:before="120" w:after="0"/>
+        <w:jc w:val="center"/>
+      </w:pPr>
+      <w:r>
+        <w:rPr>
+          <w:noProof/>
+        </w:rPr>
+        <w:drawing>
+          <wp:inline distT="0" distB="0" distL="0" distR="0">
+            <wp:extent cx="5000000" cy="3225191"/>
+            <wp:effectExtent l="0" t="0" r="0" b="0"/>
+            <wp:docPr id="990065" name="Imagen 990065"/>
+            <wp:cNvGraphicFramePr>
+              <a:graphicFrameLocks xmlns:a="http://schemas.openxmlformats.org/drawingml/2006/main" noChangeAspect="1"/>
+            </wp:cNvGraphicFramePr>
+            <a:graphic xmlns:a="http://schemas.openxmlformats.org/drawingml/2006/main">
+              <a:graphicData uri="http://schemas.openxmlformats.org/drawingml/2006/picture">
+                <pic:pic xmlns:pic="http://schemas.openxmlformats.org/drawingml/2006/picture">
+                  <pic:nvPicPr>
+                    <pic:cNvPr id="990065" name=""/>
+                    <pic:cNvPicPr/>
+                  </pic:nvPicPr>
+                  <pic:blipFill>
+                    <a:blip r:embed="rId935"/>
+                    <a:stretch>
+                      <a:fillRect/>
+                    </a:stretch>
+                  </pic:blipFill>
+                  <pic:spPr>
+                    <a:xfrm>
+                      <a:off x="0" y="0"/>
+                      <a:ext cx="5000000" cy="3225191"/>
+                    </a:xfrm>
+                    <a:prstGeom prst="rect">
+                      <a:avLst/>
+                    </a:prstGeom>
+                  </pic:spPr>
+                </pic:pic>
+              </a:graphicData>
+            </a:graphic>
+          </wp:inline>
+        </w:drawing>
+      </w:r>
+    </w:p>
+    <w:p>
+      <w:pPr>
+        <w:spacing w:before="40" w:after="120"/>
+        <w:jc w:val="center"/>
+        <w:rPr>
+          <w:rFonts w:ascii="Arial" w:hAnsi="Arial" w:cs="Arial"/>
+          <w:b/>
+          <w:bCs/>
+        </w:rPr>
+      </w:pPr>
+      <w:r>
+        <w:rPr>
+          <w:rFonts w:ascii="Arial" w:hAnsi="Arial" w:cs="Arial"/>
+          <w:b/>
+          <w:bCs/>
+        </w:rPr>
+        <w:t xml:space="preserve">Step 5: after changing the Text size from 34 to 44 and pressing APPLY CHANGES, the preview shows the new size</w:t>
+      </w:r>
+    </w:p>
+    <w:p>
+      <w:pPr>
+        <w:spacing w:before="120"/>
+        <w:rPr>
+          <w:rFonts w:ascii="Arial" w:hAnsi="Arial" w:cs="Arial"/>
+        </w:rPr>
+      </w:pPr>
+      <w:r>
+        <w:rPr>
+          <w:rFonts w:ascii="Arial" w:hAnsi="Arial" w:cs="Arial"/>
+          <w:b/>
+          <w:bCs/>
+        </w:rPr>
+        <w:t xml:space="preserve">Step 6. </w:t>
+      </w:r>
+      <w:r>
+        <w:rPr>
+          <w:rFonts w:ascii="Arial" w:hAnsi="Arial" w:cs="Arial"/>
+        </w:rPr>
+        <w:t xml:space="preserve">When all the changes are done, press UPDATE and then ACCEPT in the confirmation message to save them on the monitor. CANCEL does not save anything. Leaving the tab or reloading the page discards the changes that were not saved.</w:t>
+      </w:r>
+    </w:p>
+    <w:p>
+      <w:pPr>
+        <w:keepNext/>
+        <w:spacing w:before="120" w:after="0"/>
+        <w:jc w:val="center"/>
+      </w:pPr>
+      <w:r>
+        <w:rPr>
+          <w:noProof/>
+        </w:rPr>
+        <w:drawing>
+          <wp:inline distT="0" distB="0" distL="0" distR="0">
+            <wp:extent cx="5600000" cy="2592857"/>
+            <wp:effectExtent l="0" t="0" r="0" b="0"/>
+            <wp:docPr id="990066" name="Imagen 990066"/>
+            <wp:cNvGraphicFramePr>
+              <a:graphicFrameLocks xmlns:a="http://schemas.openxmlformats.org/drawingml/2006/main" noChangeAspect="1"/>
+            </wp:cNvGraphicFramePr>
+            <a:graphic xmlns:a="http://schemas.openxmlformats.org/drawingml/2006/main">
+              <a:graphicData uri="http://schemas.openxmlformats.org/drawingml/2006/picture">
+                <pic:pic xmlns:pic="http://schemas.openxmlformats.org/drawingml/2006/picture">
+                  <pic:nvPicPr>
+                    <pic:cNvPr id="990066" name=""/>
+                    <pic:cNvPicPr/>
+                  </pic:nvPicPr>
+                  <pic:blipFill>
+                    <a:blip r:embed="rId936"/>
+                    <a:stretch>
+                      <a:fillRect/>
+                    </a:stretch>
+                  </pic:blipFill>
+                  <pic:spPr>
+                    <a:xfrm>
+                      <a:off x="0" y="0"/>
+                      <a:ext cx="5600000" cy="2592857"/>
+                    </a:xfrm>
+                    <a:prstGeom prst="rect">
+                      <a:avLst/>
+                    </a:prstGeom>
+                  </pic:spPr>
+                </pic:pic>
+              </a:graphicData>
+            </a:graphic>
+          </wp:inline>
+        </w:drawing>
+      </w:r>
+    </w:p>
+    <w:p>
+      <w:pPr>
+        <w:spacing w:before="40" w:after="120"/>
+        <w:jc w:val="center"/>
+        <w:rPr>
+          <w:rFonts w:ascii="Arial" w:hAnsi="Arial" w:cs="Arial"/>
+          <w:b/>
+          <w:bCs/>
+        </w:rPr>
+      </w:pPr>
+      <w:r>
+        <w:rPr>
+          <w:rFonts w:ascii="Arial" w:hAnsi="Arial" w:cs="Arial"/>
+          <w:b/>
+          <w:bCs/>
+        </w:rPr>
+        <w:t xml:space="preserve">Step 6: UPDATE asks for confirmation before saving the changes on the monitor</w:t>
+      </w:r>
+    </w:p>
     <w:p>
       <w:pPr>
         <w:pStyle w:val="Heading4"/>
@@ -9499,74 +10784,18 @@
                 <w:lang w:val="en-GB" w:eastAsia="en-GB"/>
               </w:rPr>
               <w:t>{</w:t>
-            </w:r>
-            <w:r>
-              <w:rPr>
-                <w:rFonts w:ascii="Courier New" w:hAnsi="Courier New" w:cs="Courier New"/>
-                <w:color w:val="067D17"/>
-                <w:shd w:val="clear" w:color="auto" w:fill="EDFCED"/>
-                <w:lang w:val="en-GB" w:eastAsia="en-GB"/>
-              </w:rPr>
               <w:br/>
               <w:t xml:space="preserve">    "DitType":</w:t>
-            </w:r>
-            <w:r>
-              <w:rPr>
-                <w:rFonts w:ascii="Courier New" w:hAnsi="Courier New" w:cs="Courier New"/>
-                <w:color w:val="067D17"/>
-                <w:shd w:val="clear" w:color="auto" w:fill="EDFCED"/>
-                <w:lang w:val="en-GB" w:eastAsia="en-GB"/>
-              </w:rPr>
               <w:br/>
               <w:t xml:space="preserve">    {</w:t>
-            </w:r>
-            <w:r>
-              <w:rPr>
-                <w:rFonts w:ascii="Courier New" w:hAnsi="Courier New" w:cs="Courier New"/>
-                <w:color w:val="067D17"/>
-                <w:shd w:val="clear" w:color="auto" w:fill="EDFCED"/>
-                <w:lang w:val="en-GB" w:eastAsia="en-GB"/>
-              </w:rPr>
               <w:br/>
               <w:t xml:space="preserve">        "DitType": 7,</w:t>
-            </w:r>
-            <w:r>
-              <w:rPr>
-                <w:rFonts w:ascii="Courier New" w:hAnsi="Courier New" w:cs="Courier New"/>
-                <w:color w:val="067D17"/>
-                <w:shd w:val="clear" w:color="auto" w:fill="EDFCED"/>
-                <w:lang w:val="en-GB" w:eastAsia="en-GB"/>
-              </w:rPr>
               <w:br/>
               <w:t xml:space="preserve">        "DitName": "dit_CurrentCardReader"</w:t>
-            </w:r>
-            <w:r>
-              <w:rPr>
-                <w:rFonts w:ascii="Courier New" w:hAnsi="Courier New" w:cs="Courier New"/>
-                <w:color w:val="067D17"/>
-                <w:shd w:val="clear" w:color="auto" w:fill="EDFCED"/>
-                <w:lang w:val="en-GB" w:eastAsia="en-GB"/>
-              </w:rPr>
               <w:br/>
               <w:t xml:space="preserve">    },</w:t>
-            </w:r>
-            <w:r>
-              <w:rPr>
-                <w:rFonts w:ascii="Courier New" w:hAnsi="Courier New" w:cs="Courier New"/>
-                <w:color w:val="067D17"/>
-                <w:shd w:val="clear" w:color="auto" w:fill="EDFCED"/>
-                <w:lang w:val="en-GB" w:eastAsia="en-GB"/>
-              </w:rPr>
               <w:br/>
               <w:t xml:space="preserve">    "Version": 0,</w:t>
-            </w:r>
-            <w:r>
-              <w:rPr>
-                <w:rFonts w:ascii="Courier New" w:hAnsi="Courier New" w:cs="Courier New"/>
-                <w:color w:val="067D17"/>
-                <w:shd w:val="clear" w:color="auto" w:fill="EDFCED"/>
-                <w:lang w:val="en-GB" w:eastAsia="en-GB"/>
-              </w:rPr>
               <w:br/>
               <w:t xml:space="preserve">    "CardReader": </w:t>
             </w:r>
@@ -11246,6 +12475,203 @@
           <w:rFonts w:ascii="Arial" w:hAnsi="Arial" w:cs="Arial"/>
         </w:rPr>
       </w:pPr>
+    </w:p>
+    <w:p>
+      <w:pPr>
+        <w:spacing w:before="120"/>
+        <w:rPr>
+          <w:rFonts w:ascii="Arial" w:hAnsi="Arial" w:cs="Arial"/>
+        </w:rPr>
+      </w:pPr>
+      <w:r>
+        <w:rPr>
+          <w:rFonts w:ascii="Arial" w:hAnsi="Arial" w:cs="Arial"/>
+        </w:rPr>
+        <w:t xml:space="preserve">Example with the DIT type 9 (CurrentCardType) of the PLEASE_PROCEED screen. The terminal sends the following message; the monitor reads the Dits array and compares the value received in each key (for example CardClass) with the "Valid value" configured in the elements of the screen (DIT type code = 9, data key = CardClass):</w:t>
+      </w:r>
+    </w:p>
+    <w:p>
+      <w:pPr>
+        <w:spacing w:before="0" w:after="0"/>
+        <w:ind w:left="567"/>
+      </w:pPr>
+      <w:r>
+        <w:rPr>
+          <w:rFonts w:ascii="Courier New" w:hAnsi="Courier New" w:cs="Courier New"/>
+          <w:sz w:val="16"/>
+        </w:rPr>
+        <w:t xml:space="preserve">{</w:t>
+      </w:r>
+    </w:p>
+    <w:p>
+      <w:pPr>
+        <w:spacing w:before="0" w:after="0"/>
+        <w:ind w:left="567"/>
+      </w:pPr>
+      <w:r>
+        <w:rPr>
+          <w:rFonts w:ascii="Courier New" w:hAnsi="Courier New" w:cs="Courier New"/>
+          <w:sz w:val="16"/>
+        </w:rPr>
+        <w:t xml:space="preserve">  "DtoVersion": 0,</w:t>
+      </w:r>
+    </w:p>
+    <w:p>
+      <w:pPr>
+        <w:spacing w:before="0" w:after="0"/>
+        <w:ind w:left="567"/>
+      </w:pPr>
+      <w:r>
+        <w:rPr>
+          <w:rFonts w:ascii="Courier New" w:hAnsi="Courier New" w:cs="Courier New"/>
+          <w:sz w:val="16"/>
+        </w:rPr>
+        <w:t xml:space="preserve">  "TerminalNr": 12,</w:t>
+      </w:r>
+    </w:p>
+    <w:p>
+      <w:pPr>
+        <w:spacing w:before="0" w:after="0"/>
+        <w:ind w:left="567"/>
+      </w:pPr>
+      <w:r>
+        <w:rPr>
+          <w:rFonts w:ascii="Courier New" w:hAnsi="Courier New" w:cs="Courier New"/>
+          <w:sz w:val="16"/>
+        </w:rPr>
+        <w:t xml:space="preserve">  "DtoType": { "DtoType": 0, "DtoName": "DtoDialog" },</w:t>
+      </w:r>
+    </w:p>
+    <w:p>
+      <w:pPr>
+        <w:spacing w:before="0" w:after="0"/>
+        <w:ind w:left="567"/>
+      </w:pPr>
+      <w:r>
+        <w:rPr>
+          <w:rFonts w:ascii="Courier New" w:hAnsi="Courier New" w:cs="Courier New"/>
+          <w:sz w:val="16"/>
+        </w:rPr>
+        <w:t xml:space="preserve">  "Dialog": { "DialogNr": 12, "DialogName": "DLG_PLEASE_PROCEED" },</w:t>
+      </w:r>
+    </w:p>
+    <w:p>
+      <w:pPr>
+        <w:spacing w:before="0" w:after="0"/>
+        <w:ind w:left="567"/>
+      </w:pPr>
+      <w:r>
+        <w:rPr>
+          <w:rFonts w:ascii="Courier New" w:hAnsi="Courier New" w:cs="Courier New"/>
+          <w:sz w:val="16"/>
+        </w:rPr>
+        <w:t xml:space="preserve">  "Dits": [</w:t>
+      </w:r>
+    </w:p>
+    <w:p>
+      <w:pPr>
+        <w:spacing w:before="0" w:after="0"/>
+        <w:ind w:left="567"/>
+      </w:pPr>
+      <w:r>
+        <w:rPr>
+          <w:rFonts w:ascii="Courier New" w:hAnsi="Courier New" w:cs="Courier New"/>
+          <w:sz w:val="16"/>
+        </w:rPr>
+        <w:t xml:space="preserve">    { "DitType": { "DitType": 10, "DitName": "dit_CurrentLicensePlates" }, "Version": 0,</w:t>
+      </w:r>
+    </w:p>
+    <w:p>
+      <w:pPr>
+        <w:spacing w:before="0" w:after="0"/>
+        <w:ind w:left="567"/>
+      </w:pPr>
+      <w:r>
+        <w:rPr>
+          <w:rFonts w:ascii="Courier New" w:hAnsi="Courier New" w:cs="Courier New"/>
+          <w:sz w:val="16"/>
+        </w:rPr>
+        <w:t xml:space="preserve">      "MainLicensePlate": "0345FCR", "MainLicensePlateImage": "base64image",</w:t>
+      </w:r>
+    </w:p>
+    <w:p>
+      <w:pPr>
+        <w:spacing w:before="0" w:after="0"/>
+        <w:ind w:left="567"/>
+      </w:pPr>
+      <w:r>
+        <w:rPr>
+          <w:rFonts w:ascii="Courier New" w:hAnsi="Courier New" w:cs="Courier New"/>
+          <w:sz w:val="16"/>
+        </w:rPr>
+        <w:t xml:space="preserve">      "AuxiliaryLicensePlates": [ { "LicensePlateType": 0, "LicensePlate": "0345FCR" } ] },</w:t>
+      </w:r>
+    </w:p>
+    <w:p>
+      <w:pPr>
+        <w:spacing w:before="0" w:after="0"/>
+        <w:ind w:left="567"/>
+      </w:pPr>
+      <w:r>
+        <w:rPr>
+          <w:rFonts w:ascii="Courier New" w:hAnsi="Courier New" w:cs="Courier New"/>
+          <w:sz w:val="16"/>
+        </w:rPr>
+        <w:t xml:space="preserve">    { "DitType": { "DitType": 7, "DitName": "dit_CurrentCardReader" }, "Version": 0, "CardReader": 4 },</w:t>
+      </w:r>
+    </w:p>
+    <w:p>
+      <w:pPr>
+        <w:spacing w:before="0" w:after="0"/>
+        <w:ind w:left="567"/>
+      </w:pPr>
+      <w:r>
+        <w:rPr>
+          <w:rFonts w:ascii="Courier New" w:hAnsi="Courier New" w:cs="Courier New"/>
+          <w:sz w:val="16"/>
+        </w:rPr>
+        <w:t xml:space="preserve">    { "DitType": { "DitType": 9, "DitName": "dit_CurrentCardType" }, "Version": 0, "CardType": 100, "CardClass": 0 }</w:t>
+      </w:r>
+    </w:p>
+    <w:p>
+      <w:pPr>
+        <w:spacing w:before="0" w:after="0"/>
+        <w:ind w:left="567"/>
+      </w:pPr>
+      <w:r>
+        <w:rPr>
+          <w:rFonts w:ascii="Courier New" w:hAnsi="Courier New" w:cs="Courier New"/>
+          <w:sz w:val="16"/>
+        </w:rPr>
+        <w:t xml:space="preserve">  ]</w:t>
+      </w:r>
+    </w:p>
+    <w:p>
+      <w:pPr>
+        <w:spacing w:before="0" w:after="0"/>
+        <w:ind w:left="567"/>
+      </w:pPr>
+      <w:r>
+        <w:rPr>
+          <w:rFonts w:ascii="Courier New" w:hAnsi="Courier New" w:cs="Courier New"/>
+          <w:sz w:val="16"/>
+        </w:rPr>
+        <w:t xml:space="preserve">}</w:t>
+      </w:r>
+    </w:p>
+    <w:p>
+      <w:pPr>
+        <w:spacing w:before="120"/>
+        <w:rPr>
+          <w:rFonts w:ascii="Arial" w:hAnsi="Arial" w:cs="Arial"/>
+        </w:rPr>
+      </w:pPr>
+      <w:r>
+        <w:rPr>
+          <w:rFonts w:ascii="Arial" w:hAnsi="Arial" w:cs="Arial"/>
+        </w:rPr>
+        <w:t xml:space="preserve">In the current configuration of the monitor, the PLEASE_PROCEED screen has two text elements with data key CardClass and DIT type code 9: the element with Valid value 0 shows "SABA TICKETLESS" and the element with Valid value 1 shows "ABONAMENT" (subscriber). Only the element whose Valid value matches the CardClass received is shown, so with CardClass = 0 (as in the message above) the text "SABA TICKETLESS" is shown.</w:t>
+      </w:r>
     </w:p>
     <w:sectPr>
       <w:headerReference w:type="default" r:id="rId26"/>

</xml_diff>